<commit_message>
SSE endpoints and event emissions
</commit_message>
<xml_diff>
--- a/FLUTTER_CANLI_FALCILAR_PROMPT.docx
+++ b/FLUTTER_CANLI_FALCILAR_PROMPT.docx
@@ -2,7 +2,7 @@
 <file path=word/document.xml><?xml version="1.0" encoding="utf-8"?>
 <w:document xmlns:w="http://schemas.openxmlformats.org/wordprocessingml/2006/main" xmlns:m="http://schemas.openxmlformats.org/officeDocument/2006/math" xmlns:r="http://schemas.openxmlformats.org/officeDocument/2006/relationships" xmlns:o="urn:schemas-microsoft-com:office:office" xmlns:v="urn:schemas-microsoft-com:vml" xmlns:w10="urn:schemas-microsoft-com:office:word" xmlns:a="http://schemas.openxmlformats.org/drawingml/2006/main" xmlns:pic="http://schemas.openxmlformats.org/drawingml/2006/picture" xmlns:wp="http://schemas.openxmlformats.org/drawingml/2006/wordprocessingDrawing">
   <w:body>
-    <w:bookmarkStart w:id="95" w:name="X9188c1c7ac0d29fb78bbd04da05f849f0f00f2d"/>
+    <w:bookmarkStart w:id="113" w:name="X9188c1c7ac0d29fb78bbd04da05f849f0f00f2d"/>
     <w:p>
       <w:pPr>
         <w:pStyle w:val="Heading1"/>
@@ -30378,18 +30378,2862 @@
         </w:pict>
       </w:r>
     </w:p>
+    <w:p>
+      <w:r>
+        <w:pict>
+          <v:rect style="width:0;height:1.5pt" o:hralign="center" o:hrstd="t" o:hr="t"/>
+        </w:pict>
+      </w:r>
+    </w:p>
     <w:bookmarkEnd w:id="87"/>
     <w:bookmarkEnd w:id="88"/>
-    <w:bookmarkStart w:id="94" w:name="önemli-notlar"/>
+    <w:bookmarkStart w:id="93" w:name="sse-gerçek-zamanlı-oda-mesajları"/>
     <w:p>
       <w:pPr>
         <w:pStyle w:val="Heading2"/>
       </w:pPr>
       <w:r>
+        <w:t xml:space="preserve">21. SSE — Gerçek Zamanlı Oda Mesajları</w:t>
+      </w:r>
+    </w:p>
+    <w:p>
+      <w:pPr>
+        <w:pStyle w:val="BlockText"/>
+      </w:pPr>
+      <w:r>
+        <w:rPr>
+          <w:bCs/>
+          <w:b/>
+        </w:rPr>
+        <w:t xml:space="preserve">ÖNCEKİ DURUM:</w:t>
+      </w:r>
+      <w:r>
+        <w:t xml:space="preserve"> </w:t>
+      </w:r>
+      <w:r>
+        <w:t xml:space="preserve">Mesajlar 3 sn polling ile alınıyordu. Artık SSE stream var.</w:t>
+      </w:r>
+    </w:p>
+    <w:bookmarkStart w:id="89" w:name="endpoint"/>
+    <w:p>
+      <w:pPr>
+        <w:pStyle w:val="Heading3"/>
+      </w:pPr>
+      <w:r>
+        <w:t xml:space="preserve">21.1 Endpoint</w:t>
+      </w:r>
+    </w:p>
+    <w:p>
+      <w:pPr>
+        <w:pStyle w:val="SourceCode"/>
+      </w:pPr>
+      <w:r>
+        <w:rPr>
+          <w:rStyle w:val="VerbatimChar"/>
+        </w:rPr>
+        <w:t xml:space="preserve">GET /api/room/{sessionId}/stream</w:t>
+      </w:r>
+      <w:r>
+        <w:br/>
+      </w:r>
+      <w:r>
+        <w:rPr>
+          <w:rStyle w:val="VerbatimChar"/>
+        </w:rPr>
+        <w:t xml:space="preserve">Authorization: Bearer {JWT}</w:t>
+      </w:r>
+    </w:p>
+    <w:bookmarkEnd w:id="89"/>
+    <w:bookmarkStart w:id="90" w:name="sse-event-formatları"/>
+    <w:p>
+      <w:pPr>
+        <w:pStyle w:val="Heading3"/>
+      </w:pPr>
+      <w:r>
+        <w:t xml:space="preserve">21.2 SSE Event Formatları</w:t>
+      </w:r>
+    </w:p>
+    <w:p>
+      <w:pPr>
+        <w:pStyle w:val="SourceCode"/>
+      </w:pPr>
+      <w:r>
+        <w:rPr>
+          <w:rStyle w:val="VerbatimChar"/>
+        </w:rPr>
+        <w:t xml:space="preserve">event: connected</w:t>
+      </w:r>
+      <w:r>
+        <w:br/>
+      </w:r>
+      <w:r>
+        <w:rPr>
+          <w:rStyle w:val="VerbatimChar"/>
+        </w:rPr>
+        <w:t xml:space="preserve">data: {"sessionId":"...","timerStarted":true,"timerStartedAt":"..."}</w:t>
+      </w:r>
+      <w:r>
+        <w:br/>
+      </w:r>
+      <w:r>
+        <w:br/>
+      </w:r>
+      <w:r>
+        <w:rPr>
+          <w:rStyle w:val="VerbatimChar"/>
+        </w:rPr>
+        <w:t xml:space="preserve">event: message</w:t>
+      </w:r>
+      <w:r>
+        <w:br/>
+      </w:r>
+      <w:r>
+        <w:rPr>
+          <w:rStyle w:val="VerbatimChar"/>
+        </w:rPr>
+        <w:t xml:space="preserve">data: {"id":"msg_...","senderId":"user_...","message":"Merhaba","createdAt":"..."}</w:t>
+      </w:r>
+      <w:r>
+        <w:br/>
+      </w:r>
+      <w:r>
+        <w:br/>
+      </w:r>
+      <w:r>
+        <w:rPr>
+          <w:rStyle w:val="VerbatimChar"/>
+        </w:rPr>
+        <w:t xml:space="preserve">event: timer_started</w:t>
+      </w:r>
+      <w:r>
+        <w:br/>
+      </w:r>
+      <w:r>
+        <w:rPr>
+          <w:rStyle w:val="VerbatimChar"/>
+        </w:rPr>
+        <w:t xml:space="preserve">data: {"timerStartedAt":"2026-06-18T12:00:00.000Z"}</w:t>
+      </w:r>
+      <w:r>
+        <w:br/>
+      </w:r>
+      <w:r>
+        <w:br/>
+      </w:r>
+      <w:r>
+        <w:rPr>
+          <w:rStyle w:val="VerbatimChar"/>
+        </w:rPr>
+        <w:t xml:space="preserve">event: time_extended</w:t>
+      </w:r>
+      <w:r>
+        <w:br/>
+      </w:r>
+      <w:r>
+        <w:rPr>
+          <w:rStyle w:val="VerbatimChar"/>
+        </w:rPr>
+        <w:t xml:space="preserve">data: {"addedMinutes":5,"newMaxMinutes":15,"by":"user|teller"}</w:t>
+      </w:r>
+      <w:r>
+        <w:br/>
+      </w:r>
+      <w:r>
+        <w:br/>
+      </w:r>
+      <w:r>
+        <w:rPr>
+          <w:rStyle w:val="VerbatimChar"/>
+        </w:rPr>
+        <w:t xml:space="preserve">event: session_ended</w:t>
+      </w:r>
+      <w:r>
+        <w:br/>
+      </w:r>
+      <w:r>
+        <w:rPr>
+          <w:rStyle w:val="VerbatimChar"/>
+        </w:rPr>
+        <w:t xml:space="preserve">data: {"actualMinutesUsed":8,"actualCost":80,"refundAmount":20,"endedBy":"teller"}</w:t>
+      </w:r>
+      <w:r>
+        <w:br/>
+      </w:r>
+      <w:r>
+        <w:br/>
+      </w:r>
+      <w:r>
+        <w:rPr>
+          <w:rStyle w:val="VerbatimChar"/>
+        </w:rPr>
+        <w:t xml:space="preserve">event: heartbeat</w:t>
+      </w:r>
+      <w:r>
+        <w:br/>
+      </w:r>
+      <w:r>
+        <w:rPr>
+          <w:rStyle w:val="VerbatimChar"/>
+        </w:rPr>
+        <w:t xml:space="preserve">data: {"ts":1718712345678}</w:t>
+      </w:r>
+    </w:p>
+    <w:bookmarkEnd w:id="90"/>
+    <w:bookmarkStart w:id="91" w:name="flutter-service-roomsseservice"/>
+    <w:p>
+      <w:pPr>
+        <w:pStyle w:val="Heading3"/>
+      </w:pPr>
+      <w:r>
+        <w:t xml:space="preserve">21.3 Flutter Service —</w:t>
+      </w:r>
+      <w:r>
+        <w:t xml:space="preserve"> </w:t>
+      </w:r>
+      <w:r>
+        <w:rPr>
+          <w:rStyle w:val="VerbatimChar"/>
+        </w:rPr>
+        <w:t xml:space="preserve">RoomSseService</w:t>
+      </w:r>
+    </w:p>
+    <w:p>
+      <w:pPr>
+        <w:pStyle w:val="SourceCode"/>
+      </w:pPr>
+      <w:r>
+        <w:rPr>
+          <w:rStyle w:val="VerbatimChar"/>
+        </w:rPr>
+        <w:t xml:space="preserve">import 'dart:async';</w:t>
+      </w:r>
+      <w:r>
+        <w:br/>
+      </w:r>
+      <w:r>
+        <w:rPr>
+          <w:rStyle w:val="VerbatimChar"/>
+        </w:rPr>
+        <w:t xml:space="preserve">import 'dart:convert';</w:t>
+      </w:r>
+      <w:r>
+        <w:br/>
+      </w:r>
+      <w:r>
+        <w:rPr>
+          <w:rStyle w:val="VerbatimChar"/>
+        </w:rPr>
+        <w:t xml:space="preserve">import 'package:http/http.dart' as http;</w:t>
+      </w:r>
+      <w:r>
+        <w:br/>
+      </w:r>
+      <w:r>
+        <w:br/>
+      </w:r>
+      <w:r>
+        <w:rPr>
+          <w:rStyle w:val="VerbatimChar"/>
+        </w:rPr>
+        <w:t xml:space="preserve">class RoomSseService {</w:t>
+      </w:r>
+      <w:r>
+        <w:br/>
+      </w:r>
+      <w:r>
+        <w:rPr>
+          <w:rStyle w:val="VerbatimChar"/>
+        </w:rPr>
+        <w:t xml:space="preserve">  final String baseUrl;</w:t>
+      </w:r>
+      <w:r>
+        <w:br/>
+      </w:r>
+      <w:r>
+        <w:rPr>
+          <w:rStyle w:val="VerbatimChar"/>
+        </w:rPr>
+        <w:t xml:space="preserve">  final String token;</w:t>
+      </w:r>
+      <w:r>
+        <w:br/>
+      </w:r>
+      <w:r>
+        <w:rPr>
+          <w:rStyle w:val="VerbatimChar"/>
+        </w:rPr>
+        <w:t xml:space="preserve">  http.Client? _client;</w:t>
+      </w:r>
+      <w:r>
+        <w:br/>
+      </w:r>
+      <w:r>
+        <w:rPr>
+          <w:rStyle w:val="VerbatimChar"/>
+        </w:rPr>
+        <w:t xml:space="preserve">  StreamController&lt;Map&lt;String, dynamic&gt;&gt;? _controller;</w:t>
+      </w:r>
+      <w:r>
+        <w:br/>
+      </w:r>
+      <w:r>
+        <w:rPr>
+          <w:rStyle w:val="VerbatimChar"/>
+        </w:rPr>
+        <w:t xml:space="preserve">  bool _isActive = false;</w:t>
+      </w:r>
+      <w:r>
+        <w:br/>
+      </w:r>
+      <w:r>
+        <w:br/>
+      </w:r>
+      <w:r>
+        <w:rPr>
+          <w:rStyle w:val="VerbatimChar"/>
+        </w:rPr>
+        <w:t xml:space="preserve">  RoomSseService({required this.baseUrl, required this.token});</w:t>
+      </w:r>
+      <w:r>
+        <w:br/>
+      </w:r>
+      <w:r>
+        <w:br/>
+      </w:r>
+      <w:r>
+        <w:rPr>
+          <w:rStyle w:val="VerbatimChar"/>
+        </w:rPr>
+        <w:t xml:space="preserve">  Stream&lt;Map&lt;String, dynamic&gt;&gt; connect(String sessionId) {</w:t>
+      </w:r>
+      <w:r>
+        <w:br/>
+      </w:r>
+      <w:r>
+        <w:rPr>
+          <w:rStyle w:val="VerbatimChar"/>
+        </w:rPr>
+        <w:t xml:space="preserve">    _controller = StreamController&lt;Map&lt;String, dynamic&gt;&gt;.broadcast();</w:t>
+      </w:r>
+      <w:r>
+        <w:br/>
+      </w:r>
+      <w:r>
+        <w:rPr>
+          <w:rStyle w:val="VerbatimChar"/>
+        </w:rPr>
+        <w:t xml:space="preserve">    _isActive = true;</w:t>
+      </w:r>
+      <w:r>
+        <w:br/>
+      </w:r>
+      <w:r>
+        <w:rPr>
+          <w:rStyle w:val="VerbatimChar"/>
+        </w:rPr>
+        <w:t xml:space="preserve">    _startListening(sessionId);</w:t>
+      </w:r>
+      <w:r>
+        <w:br/>
+      </w:r>
+      <w:r>
+        <w:rPr>
+          <w:rStyle w:val="VerbatimChar"/>
+        </w:rPr>
+        <w:t xml:space="preserve">    return _controller!.stream;</w:t>
+      </w:r>
+      <w:r>
+        <w:br/>
+      </w:r>
+      <w:r>
+        <w:rPr>
+          <w:rStyle w:val="VerbatimChar"/>
+        </w:rPr>
+        <w:t xml:space="preserve">  }</w:t>
+      </w:r>
+      <w:r>
+        <w:br/>
+      </w:r>
+      <w:r>
+        <w:br/>
+      </w:r>
+      <w:r>
+        <w:rPr>
+          <w:rStyle w:val="VerbatimChar"/>
+        </w:rPr>
+        <w:t xml:space="preserve">  void _startListening(String sessionId) async {</w:t>
+      </w:r>
+      <w:r>
+        <w:br/>
+      </w:r>
+      <w:r>
+        <w:rPr>
+          <w:rStyle w:val="VerbatimChar"/>
+        </w:rPr>
+        <w:t xml:space="preserve">    while (_isActive) {</w:t>
+      </w:r>
+      <w:r>
+        <w:br/>
+      </w:r>
+      <w:r>
+        <w:rPr>
+          <w:rStyle w:val="VerbatimChar"/>
+        </w:rPr>
+        <w:t xml:space="preserve">      try {</w:t>
+      </w:r>
+      <w:r>
+        <w:br/>
+      </w:r>
+      <w:r>
+        <w:rPr>
+          <w:rStyle w:val="VerbatimChar"/>
+        </w:rPr>
+        <w:t xml:space="preserve">        _client = http.Client();</w:t>
+      </w:r>
+      <w:r>
+        <w:br/>
+      </w:r>
+      <w:r>
+        <w:rPr>
+          <w:rStyle w:val="VerbatimChar"/>
+        </w:rPr>
+        <w:t xml:space="preserve">        final request = http.Request(</w:t>
+      </w:r>
+      <w:r>
+        <w:br/>
+      </w:r>
+      <w:r>
+        <w:rPr>
+          <w:rStyle w:val="VerbatimChar"/>
+        </w:rPr>
+        <w:t xml:space="preserve">          'GET',</w:t>
+      </w:r>
+      <w:r>
+        <w:br/>
+      </w:r>
+      <w:r>
+        <w:rPr>
+          <w:rStyle w:val="VerbatimChar"/>
+        </w:rPr>
+        <w:t xml:space="preserve">          Uri.parse('$baseUrl/api/room/$sessionId/stream'),</w:t>
+      </w:r>
+      <w:r>
+        <w:br/>
+      </w:r>
+      <w:r>
+        <w:rPr>
+          <w:rStyle w:val="VerbatimChar"/>
+        </w:rPr>
+        <w:t xml:space="preserve">        );</w:t>
+      </w:r>
+      <w:r>
+        <w:br/>
+      </w:r>
+      <w:r>
+        <w:rPr>
+          <w:rStyle w:val="VerbatimChar"/>
+        </w:rPr>
+        <w:t xml:space="preserve">        request.headers['Authorization'] = 'Bearer $token';</w:t>
+      </w:r>
+      <w:r>
+        <w:br/>
+      </w:r>
+      <w:r>
+        <w:rPr>
+          <w:rStyle w:val="VerbatimChar"/>
+        </w:rPr>
+        <w:t xml:space="preserve">        request.headers['Accept'] = 'text/event-stream';</w:t>
+      </w:r>
+      <w:r>
+        <w:br/>
+      </w:r>
+      <w:r>
+        <w:rPr>
+          <w:rStyle w:val="VerbatimChar"/>
+        </w:rPr>
+        <w:t xml:space="preserve">        request.headers['Cache-Control'] = 'no-cache';</w:t>
+      </w:r>
+      <w:r>
+        <w:br/>
+      </w:r>
+      <w:r>
+        <w:br/>
+      </w:r>
+      <w:r>
+        <w:rPr>
+          <w:rStyle w:val="VerbatimChar"/>
+        </w:rPr>
+        <w:t xml:space="preserve">        final response = await _client!.send(request);</w:t>
+      </w:r>
+      <w:r>
+        <w:br/>
+      </w:r>
+      <w:r>
+        <w:rPr>
+          <w:rStyle w:val="VerbatimChar"/>
+        </w:rPr>
+        <w:t xml:space="preserve">        if (response.statusCode != 200) {</w:t>
+      </w:r>
+      <w:r>
+        <w:br/>
+      </w:r>
+      <w:r>
+        <w:rPr>
+          <w:rStyle w:val="VerbatimChar"/>
+        </w:rPr>
+        <w:t xml:space="preserve">          await Future.delayed(Duration(seconds: 3));</w:t>
+      </w:r>
+      <w:r>
+        <w:br/>
+      </w:r>
+      <w:r>
+        <w:rPr>
+          <w:rStyle w:val="VerbatimChar"/>
+        </w:rPr>
+        <w:t xml:space="preserve">          continue;</w:t>
+      </w:r>
+      <w:r>
+        <w:br/>
+      </w:r>
+      <w:r>
+        <w:rPr>
+          <w:rStyle w:val="VerbatimChar"/>
+        </w:rPr>
+        <w:t xml:space="preserve">        }</w:t>
+      </w:r>
+      <w:r>
+        <w:br/>
+      </w:r>
+      <w:r>
+        <w:br/>
+      </w:r>
+      <w:r>
+        <w:rPr>
+          <w:rStyle w:val="VerbatimChar"/>
+        </w:rPr>
+        <w:t xml:space="preserve">        String buffer = '';</w:t>
+      </w:r>
+      <w:r>
+        <w:br/>
+      </w:r>
+      <w:r>
+        <w:rPr>
+          <w:rStyle w:val="VerbatimChar"/>
+        </w:rPr>
+        <w:t xml:space="preserve">        await for (final chunk in response.stream.transform(utf8.decoder)) {</w:t>
+      </w:r>
+      <w:r>
+        <w:br/>
+      </w:r>
+      <w:r>
+        <w:rPr>
+          <w:rStyle w:val="VerbatimChar"/>
+        </w:rPr>
+        <w:t xml:space="preserve">          buffer += chunk;</w:t>
+      </w:r>
+      <w:r>
+        <w:br/>
+      </w:r>
+      <w:r>
+        <w:rPr>
+          <w:rStyle w:val="VerbatimChar"/>
+        </w:rPr>
+        <w:t xml:space="preserve">          while (buffer.contains('\n\n')) {</w:t>
+      </w:r>
+      <w:r>
+        <w:br/>
+      </w:r>
+      <w:r>
+        <w:rPr>
+          <w:rStyle w:val="VerbatimChar"/>
+        </w:rPr>
+        <w:t xml:space="preserve">            final idx = buffer.indexOf('\n\n');</w:t>
+      </w:r>
+      <w:r>
+        <w:br/>
+      </w:r>
+      <w:r>
+        <w:rPr>
+          <w:rStyle w:val="VerbatimChar"/>
+        </w:rPr>
+        <w:t xml:space="preserve">            final raw = buffer.substring(0, idx);</w:t>
+      </w:r>
+      <w:r>
+        <w:br/>
+      </w:r>
+      <w:r>
+        <w:rPr>
+          <w:rStyle w:val="VerbatimChar"/>
+        </w:rPr>
+        <w:t xml:space="preserve">            buffer = buffer.substring(idx + 2);</w:t>
+      </w:r>
+      <w:r>
+        <w:br/>
+      </w:r>
+      <w:r>
+        <w:br/>
+      </w:r>
+      <w:r>
+        <w:rPr>
+          <w:rStyle w:val="VerbatimChar"/>
+        </w:rPr>
+        <w:t xml:space="preserve">            String? eventType;</w:t>
+      </w:r>
+      <w:r>
+        <w:br/>
+      </w:r>
+      <w:r>
+        <w:rPr>
+          <w:rStyle w:val="VerbatimChar"/>
+        </w:rPr>
+        <w:t xml:space="preserve">            String? data;</w:t>
+      </w:r>
+      <w:r>
+        <w:br/>
+      </w:r>
+      <w:r>
+        <w:rPr>
+          <w:rStyle w:val="VerbatimChar"/>
+        </w:rPr>
+        <w:t xml:space="preserve">            for (final line in raw.split('\n')) {</w:t>
+      </w:r>
+      <w:r>
+        <w:br/>
+      </w:r>
+      <w:r>
+        <w:rPr>
+          <w:rStyle w:val="VerbatimChar"/>
+        </w:rPr>
+        <w:t xml:space="preserve">              if (line.startsWith('event: ')) eventType = line.substring(7).trim();</w:t>
+      </w:r>
+      <w:r>
+        <w:br/>
+      </w:r>
+      <w:r>
+        <w:rPr>
+          <w:rStyle w:val="VerbatimChar"/>
+        </w:rPr>
+        <w:t xml:space="preserve">              if (line.startsWith('data: ')) data = line.substring(6).trim();</w:t>
+      </w:r>
+      <w:r>
+        <w:br/>
+      </w:r>
+      <w:r>
+        <w:rPr>
+          <w:rStyle w:val="VerbatimChar"/>
+        </w:rPr>
+        <w:t xml:space="preserve">            }</w:t>
+      </w:r>
+      <w:r>
+        <w:br/>
+      </w:r>
+      <w:r>
+        <w:rPr>
+          <w:rStyle w:val="VerbatimChar"/>
+        </w:rPr>
+        <w:t xml:space="preserve">            if (data != null &amp;&amp; eventType != null &amp;&amp; eventType != 'heartbeat') {</w:t>
+      </w:r>
+      <w:r>
+        <w:br/>
+      </w:r>
+      <w:r>
+        <w:rPr>
+          <w:rStyle w:val="VerbatimChar"/>
+        </w:rPr>
+        <w:t xml:space="preserve">              try {</w:t>
+      </w:r>
+      <w:r>
+        <w:br/>
+      </w:r>
+      <w:r>
+        <w:rPr>
+          <w:rStyle w:val="VerbatimChar"/>
+        </w:rPr>
+        <w:t xml:space="preserve">                final parsed = jsonDecode(data) as Map&lt;String, dynamic&gt;;</w:t>
+      </w:r>
+      <w:r>
+        <w:br/>
+      </w:r>
+      <w:r>
+        <w:rPr>
+          <w:rStyle w:val="VerbatimChar"/>
+        </w:rPr>
+        <w:t xml:space="preserve">                parsed['_event'] = eventType;</w:t>
+      </w:r>
+      <w:r>
+        <w:br/>
+      </w:r>
+      <w:r>
+        <w:rPr>
+          <w:rStyle w:val="VerbatimChar"/>
+        </w:rPr>
+        <w:t xml:space="preserve">                _controller?.add(parsed);</w:t>
+      </w:r>
+      <w:r>
+        <w:br/>
+      </w:r>
+      <w:r>
+        <w:rPr>
+          <w:rStyle w:val="VerbatimChar"/>
+        </w:rPr>
+        <w:t xml:space="preserve">              } catch (_) {}</w:t>
+      </w:r>
+      <w:r>
+        <w:br/>
+      </w:r>
+      <w:r>
+        <w:rPr>
+          <w:rStyle w:val="VerbatimChar"/>
+        </w:rPr>
+        <w:t xml:space="preserve">            }</w:t>
+      </w:r>
+      <w:r>
+        <w:br/>
+      </w:r>
+      <w:r>
+        <w:rPr>
+          <w:rStyle w:val="VerbatimChar"/>
+        </w:rPr>
+        <w:t xml:space="preserve">          }</w:t>
+      </w:r>
+      <w:r>
+        <w:br/>
+      </w:r>
+      <w:r>
+        <w:rPr>
+          <w:rStyle w:val="VerbatimChar"/>
+        </w:rPr>
+        <w:t xml:space="preserve">        }</w:t>
+      </w:r>
+      <w:r>
+        <w:br/>
+      </w:r>
+      <w:r>
+        <w:rPr>
+          <w:rStyle w:val="VerbatimChar"/>
+        </w:rPr>
+        <w:t xml:space="preserve">      } catch (e) {</w:t>
+      </w:r>
+      <w:r>
+        <w:br/>
+      </w:r>
+      <w:r>
+        <w:rPr>
+          <w:rStyle w:val="VerbatimChar"/>
+        </w:rPr>
+        <w:t xml:space="preserve">        if (!_isActive) break;</w:t>
+      </w:r>
+      <w:r>
+        <w:br/>
+      </w:r>
+      <w:r>
+        <w:rPr>
+          <w:rStyle w:val="VerbatimChar"/>
+        </w:rPr>
+        <w:t xml:space="preserve">        await Future.delayed(Duration(seconds: 3));</w:t>
+      </w:r>
+      <w:r>
+        <w:br/>
+      </w:r>
+      <w:r>
+        <w:rPr>
+          <w:rStyle w:val="VerbatimChar"/>
+        </w:rPr>
+        <w:t xml:space="preserve">      }</w:t>
+      </w:r>
+      <w:r>
+        <w:br/>
+      </w:r>
+      <w:r>
+        <w:rPr>
+          <w:rStyle w:val="VerbatimChar"/>
+        </w:rPr>
+        <w:t xml:space="preserve">    }</w:t>
+      </w:r>
+      <w:r>
+        <w:br/>
+      </w:r>
+      <w:r>
+        <w:rPr>
+          <w:rStyle w:val="VerbatimChar"/>
+        </w:rPr>
+        <w:t xml:space="preserve">  }</w:t>
+      </w:r>
+      <w:r>
+        <w:br/>
+      </w:r>
+      <w:r>
+        <w:br/>
+      </w:r>
+      <w:r>
+        <w:rPr>
+          <w:rStyle w:val="VerbatimChar"/>
+        </w:rPr>
+        <w:t xml:space="preserve">  void disconnect() {</w:t>
+      </w:r>
+      <w:r>
+        <w:br/>
+      </w:r>
+      <w:r>
+        <w:rPr>
+          <w:rStyle w:val="VerbatimChar"/>
+        </w:rPr>
+        <w:t xml:space="preserve">    _isActive = false;</w:t>
+      </w:r>
+      <w:r>
+        <w:br/>
+      </w:r>
+      <w:r>
+        <w:rPr>
+          <w:rStyle w:val="VerbatimChar"/>
+        </w:rPr>
+        <w:t xml:space="preserve">    _client?.close();</w:t>
+      </w:r>
+      <w:r>
+        <w:br/>
+      </w:r>
+      <w:r>
+        <w:rPr>
+          <w:rStyle w:val="VerbatimChar"/>
+        </w:rPr>
+        <w:t xml:space="preserve">    _controller?.close();</w:t>
+      </w:r>
+      <w:r>
+        <w:br/>
+      </w:r>
+      <w:r>
+        <w:rPr>
+          <w:rStyle w:val="VerbatimChar"/>
+        </w:rPr>
+        <w:t xml:space="preserve">  }</w:t>
+      </w:r>
+      <w:r>
+        <w:br/>
+      </w:r>
+      <w:r>
+        <w:rPr>
+          <w:rStyle w:val="VerbatimChar"/>
+        </w:rPr>
+        <w:t xml:space="preserve">}</w:t>
+      </w:r>
+    </w:p>
+    <w:bookmarkEnd w:id="91"/>
+    <w:bookmarkStart w:id="92" w:name="kullanım"/>
+    <w:p>
+      <w:pPr>
+        <w:pStyle w:val="Heading3"/>
+      </w:pPr>
+      <w:r>
+        <w:t xml:space="preserve">21.4 Kullanım</w:t>
+      </w:r>
+    </w:p>
+    <w:p>
+      <w:pPr>
+        <w:pStyle w:val="SourceCode"/>
+      </w:pPr>
+      <w:r>
+        <w:rPr>
+          <w:rStyle w:val="VerbatimChar"/>
+        </w:rPr>
+        <w:t xml:space="preserve">final sseSvc = RoomSseService(baseUrl: 'https://canlifal.com', token: jwt);</w:t>
+      </w:r>
+      <w:r>
+        <w:br/>
+      </w:r>
+      <w:r>
+        <w:rPr>
+          <w:rStyle w:val="VerbatimChar"/>
+        </w:rPr>
+        <w:t xml:space="preserve">final stream = sseSvc.connect(sessionId);</w:t>
+      </w:r>
+      <w:r>
+        <w:br/>
+      </w:r>
+      <w:r>
+        <w:br/>
+      </w:r>
+      <w:r>
+        <w:rPr>
+          <w:rStyle w:val="VerbatimChar"/>
+        </w:rPr>
+        <w:t xml:space="preserve">stream.listen((event) {</w:t>
+      </w:r>
+      <w:r>
+        <w:br/>
+      </w:r>
+      <w:r>
+        <w:rPr>
+          <w:rStyle w:val="VerbatimChar"/>
+        </w:rPr>
+        <w:t xml:space="preserve">  switch (event['_event']) {</w:t>
+      </w:r>
+      <w:r>
+        <w:br/>
+      </w:r>
+      <w:r>
+        <w:rPr>
+          <w:rStyle w:val="VerbatimChar"/>
+        </w:rPr>
+        <w:t xml:space="preserve">    case 'message':</w:t>
+      </w:r>
+      <w:r>
+        <w:br/>
+      </w:r>
+      <w:r>
+        <w:rPr>
+          <w:rStyle w:val="VerbatimChar"/>
+        </w:rPr>
+        <w:t xml:space="preserve">      // Mesajı listeye ekle</w:t>
+      </w:r>
+      <w:r>
+        <w:br/>
+      </w:r>
+      <w:r>
+        <w:rPr>
+          <w:rStyle w:val="VerbatimChar"/>
+        </w:rPr>
+        <w:t xml:space="preserve">      setState(() =&gt; messages.add(ChatMessage.fromJson(event)));</w:t>
+      </w:r>
+      <w:r>
+        <w:br/>
+      </w:r>
+      <w:r>
+        <w:rPr>
+          <w:rStyle w:val="VerbatimChar"/>
+        </w:rPr>
+        <w:t xml:space="preserve">      break;</w:t>
+      </w:r>
+      <w:r>
+        <w:br/>
+      </w:r>
+      <w:r>
+        <w:rPr>
+          <w:rStyle w:val="VerbatimChar"/>
+        </w:rPr>
+        <w:t xml:space="preserve">    case 'timer_started':</w:t>
+      </w:r>
+      <w:r>
+        <w:br/>
+      </w:r>
+      <w:r>
+        <w:rPr>
+          <w:rStyle w:val="VerbatimChar"/>
+        </w:rPr>
+        <w:t xml:space="preserve">      setState(() =&gt; timerStarted = true);</w:t>
+      </w:r>
+      <w:r>
+        <w:br/>
+      </w:r>
+      <w:r>
+        <w:rPr>
+          <w:rStyle w:val="VerbatimChar"/>
+        </w:rPr>
+        <w:t xml:space="preserve">      break;</w:t>
+      </w:r>
+      <w:r>
+        <w:br/>
+      </w:r>
+      <w:r>
+        <w:rPr>
+          <w:rStyle w:val="VerbatimChar"/>
+        </w:rPr>
+        <w:t xml:space="preserve">    case 'time_extended':</w:t>
+      </w:r>
+      <w:r>
+        <w:br/>
+      </w:r>
+      <w:r>
+        <w:rPr>
+          <w:rStyle w:val="VerbatimChar"/>
+        </w:rPr>
+        <w:t xml:space="preserve">      setState(() =&gt; maxMinutes = event['newMaxMinutes']);</w:t>
+      </w:r>
+      <w:r>
+        <w:br/>
+      </w:r>
+      <w:r>
+        <w:rPr>
+          <w:rStyle w:val="VerbatimChar"/>
+        </w:rPr>
+        <w:t xml:space="preserve">      break;</w:t>
+      </w:r>
+      <w:r>
+        <w:br/>
+      </w:r>
+      <w:r>
+        <w:rPr>
+          <w:rStyle w:val="VerbatimChar"/>
+        </w:rPr>
+        <w:t xml:space="preserve">    case 'session_ended':</w:t>
+      </w:r>
+      <w:r>
+        <w:br/>
+      </w:r>
+      <w:r>
+        <w:rPr>
+          <w:rStyle w:val="VerbatimChar"/>
+        </w:rPr>
+        <w:t xml:space="preserve">      _handleSessionEnd(event);</w:t>
+      </w:r>
+      <w:r>
+        <w:br/>
+      </w:r>
+      <w:r>
+        <w:rPr>
+          <w:rStyle w:val="VerbatimChar"/>
+        </w:rPr>
+        <w:t xml:space="preserve">      break;</w:t>
+      </w:r>
+      <w:r>
+        <w:br/>
+      </w:r>
+      <w:r>
+        <w:rPr>
+          <w:rStyle w:val="VerbatimChar"/>
+        </w:rPr>
+        <w:t xml:space="preserve">  }</w:t>
+      </w:r>
+      <w:r>
+        <w:br/>
+      </w:r>
+      <w:r>
+        <w:rPr>
+          <w:rStyle w:val="VerbatimChar"/>
+        </w:rPr>
+        <w:t xml:space="preserve">});</w:t>
+      </w:r>
+      <w:r>
+        <w:br/>
+      </w:r>
+      <w:r>
+        <w:br/>
+      </w:r>
+      <w:r>
+        <w:rPr>
+          <w:rStyle w:val="VerbatimChar"/>
+        </w:rPr>
+        <w:t xml:space="preserve">// Temizlik</w:t>
+      </w:r>
+      <w:r>
+        <w:br/>
+      </w:r>
+      <w:r>
+        <w:rPr>
+          <w:rStyle w:val="VerbatimChar"/>
+        </w:rPr>
+        <w:t xml:space="preserve">@override</w:t>
+      </w:r>
+      <w:r>
+        <w:br/>
+      </w:r>
+      <w:r>
+        <w:rPr>
+          <w:rStyle w:val="VerbatimChar"/>
+        </w:rPr>
+        <w:t xml:space="preserve">void dispose() {</w:t>
+      </w:r>
+      <w:r>
+        <w:br/>
+      </w:r>
+      <w:r>
+        <w:rPr>
+          <w:rStyle w:val="VerbatimChar"/>
+        </w:rPr>
+        <w:t xml:space="preserve">  sseSvc.disconnect();</w:t>
+      </w:r>
+      <w:r>
+        <w:br/>
+      </w:r>
+      <w:r>
+        <w:rPr>
+          <w:rStyle w:val="VerbatimChar"/>
+        </w:rPr>
+        <w:t xml:space="preserve">  super.dispose();</w:t>
+      </w:r>
+      <w:r>
+        <w:br/>
+      </w:r>
+      <w:r>
+        <w:rPr>
+          <w:rStyle w:val="VerbatimChar"/>
+        </w:rPr>
+        <w:t xml:space="preserve">}</w:t>
+      </w:r>
+    </w:p>
+    <w:p>
+      <w:pPr>
+        <w:pStyle w:val="BlockText"/>
+      </w:pPr>
+      <w:r>
+        <w:rPr>
+          <w:bCs/>
+          <w:b/>
+        </w:rPr>
+        <w:t xml:space="preserve">ÖNEMLİ:</w:t>
+      </w:r>
+      <w:r>
+        <w:t xml:space="preserve"> </w:t>
+      </w:r>
+      <w:r>
+        <w:t xml:space="preserve">SSE bağlantısı açıkken polling yapılmamalı. Fallback olarak SSE bağlanamazsa 3s polling’e dön.</w:t>
+      </w:r>
+    </w:p>
+    <w:p>
+      <w:r>
+        <w:pict>
+          <v:rect style="width:0;height:1.5pt" o:hralign="center" o:hrstd="t" o:hr="t"/>
+        </w:pict>
+      </w:r>
+    </w:p>
+    <w:bookmarkEnd w:id="92"/>
+    <w:bookmarkEnd w:id="93"/>
+    <w:bookmarkStart w:id="97" w:name="sse-falcı-için-gelen-seans-talepleri"/>
+    <w:p>
+      <w:pPr>
+        <w:pStyle w:val="Heading2"/>
+      </w:pPr>
+      <w:r>
+        <w:t xml:space="preserve">22. SSE — Falcı İçin Gelen Seans Talepleri</w:t>
+      </w:r>
+    </w:p>
+    <w:p>
+      <w:pPr>
+        <w:pStyle w:val="BlockText"/>
+      </w:pPr>
+      <w:r>
+        <w:rPr>
+          <w:bCs/>
+          <w:b/>
+        </w:rPr>
+        <w:t xml:space="preserve">ÖNCEKİ DURUM:</w:t>
+      </w:r>
+      <w:r>
+        <w:t xml:space="preserve"> </w:t>
+      </w:r>
+      <w:r>
+        <w:t xml:space="preserve">Falcı gelen talepleri 3-5s polling ile alıyordu. Artık SSE var.</w:t>
+      </w:r>
+    </w:p>
+    <w:bookmarkStart w:id="94" w:name="endpoint-1"/>
+    <w:p>
+      <w:pPr>
+        <w:pStyle w:val="Heading3"/>
+      </w:pPr>
+      <w:r>
+        <w:t xml:space="preserve">22.1 Endpoint</w:t>
+      </w:r>
+    </w:p>
+    <w:p>
+      <w:pPr>
+        <w:pStyle w:val="SourceCode"/>
+      </w:pPr>
+      <w:r>
+        <w:rPr>
+          <w:rStyle w:val="VerbatimChar"/>
+        </w:rPr>
+        <w:t xml:space="preserve">GET /api/fortune-tellers/sessions/stream</w:t>
+      </w:r>
+      <w:r>
+        <w:br/>
+      </w:r>
+      <w:r>
+        <w:rPr>
+          <w:rStyle w:val="VerbatimChar"/>
+        </w:rPr>
+        <w:t xml:space="preserve">Authorization: Bearer {JWT}</w:t>
+      </w:r>
+    </w:p>
+    <w:bookmarkEnd w:id="94"/>
+    <w:bookmarkStart w:id="95" w:name="sse-event-formatları-1"/>
+    <w:p>
+      <w:pPr>
+        <w:pStyle w:val="Heading3"/>
+      </w:pPr>
+      <w:r>
+        <w:t xml:space="preserve">22.2 SSE Event Formatları</w:t>
+      </w:r>
+    </w:p>
+    <w:p>
+      <w:pPr>
+        <w:pStyle w:val="SourceCode"/>
+      </w:pPr>
+      <w:r>
+        <w:rPr>
+          <w:rStyle w:val="VerbatimChar"/>
+        </w:rPr>
+        <w:t xml:space="preserve">event: connected</w:t>
+      </w:r>
+      <w:r>
+        <w:br/>
+      </w:r>
+      <w:r>
+        <w:rPr>
+          <w:rStyle w:val="VerbatimChar"/>
+        </w:rPr>
+        <w:t xml:space="preserve">data: {"tellerId":"...","pendingSessions":[...]}</w:t>
+      </w:r>
+      <w:r>
+        <w:br/>
+      </w:r>
+      <w:r>
+        <w:br/>
+      </w:r>
+      <w:r>
+        <w:rPr>
+          <w:rStyle w:val="VerbatimChar"/>
+        </w:rPr>
+        <w:t xml:space="preserve">event: session_request</w:t>
+      </w:r>
+      <w:r>
+        <w:br/>
+      </w:r>
+      <w:r>
+        <w:rPr>
+          <w:rStyle w:val="VerbatimChar"/>
+        </w:rPr>
+        <w:t xml:space="preserve">data: {"sessionId":"...","userId":"...","userName":"Ali","fortuneType":"coffee","duration":10}</w:t>
+      </w:r>
+      <w:r>
+        <w:br/>
+      </w:r>
+      <w:r>
+        <w:br/>
+      </w:r>
+      <w:r>
+        <w:rPr>
+          <w:rStyle w:val="VerbatimChar"/>
+        </w:rPr>
+        <w:t xml:space="preserve">event: session_cancelled</w:t>
+      </w:r>
+      <w:r>
+        <w:br/>
+      </w:r>
+      <w:r>
+        <w:rPr>
+          <w:rStyle w:val="VerbatimChar"/>
+        </w:rPr>
+        <w:t xml:space="preserve">data: {"sessionId":"...","action":"cancel"}</w:t>
+      </w:r>
+      <w:r>
+        <w:br/>
+      </w:r>
+      <w:r>
+        <w:br/>
+      </w:r>
+      <w:r>
+        <w:rPr>
+          <w:rStyle w:val="VerbatimChar"/>
+        </w:rPr>
+        <w:t xml:space="preserve">event: pending_sessions</w:t>
+      </w:r>
+      <w:r>
+        <w:br/>
+      </w:r>
+      <w:r>
+        <w:rPr>
+          <w:rStyle w:val="VerbatimChar"/>
+        </w:rPr>
+        <w:t xml:space="preserve">data: [{"id":"...","userId":"...","fortuneType":"tarot",...}]</w:t>
+      </w:r>
+      <w:r>
+        <w:br/>
+      </w:r>
+      <w:r>
+        <w:br/>
+      </w:r>
+      <w:r>
+        <w:rPr>
+          <w:rStyle w:val="VerbatimChar"/>
+        </w:rPr>
+        <w:t xml:space="preserve">event: heartbeat</w:t>
+      </w:r>
+      <w:r>
+        <w:br/>
+      </w:r>
+      <w:r>
+        <w:rPr>
+          <w:rStyle w:val="VerbatimChar"/>
+        </w:rPr>
+        <w:t xml:space="preserve">data: {"ts":1718712345678}</w:t>
+      </w:r>
+    </w:p>
+    <w:bookmarkEnd w:id="95"/>
+    <w:bookmarkStart w:id="96" w:name="flutter-service-tellersseservice"/>
+    <w:p>
+      <w:pPr>
+        <w:pStyle w:val="Heading3"/>
+      </w:pPr>
+      <w:r>
+        <w:t xml:space="preserve">22.3 Flutter Service —</w:t>
+      </w:r>
+      <w:r>
+        <w:t xml:space="preserve"> </w:t>
+      </w:r>
+      <w:r>
+        <w:rPr>
+          <w:rStyle w:val="VerbatimChar"/>
+        </w:rPr>
+        <w:t xml:space="preserve">TellerSseService</w:t>
+      </w:r>
+    </w:p>
+    <w:p>
+      <w:pPr>
+        <w:pStyle w:val="SourceCode"/>
+      </w:pPr>
+      <w:r>
+        <w:rPr>
+          <w:rStyle w:val="VerbatimChar"/>
+        </w:rPr>
+        <w:t xml:space="preserve">class TellerSseService {</w:t>
+      </w:r>
+      <w:r>
+        <w:br/>
+      </w:r>
+      <w:r>
+        <w:rPr>
+          <w:rStyle w:val="VerbatimChar"/>
+        </w:rPr>
+        <w:t xml:space="preserve">  final String baseUrl;</w:t>
+      </w:r>
+      <w:r>
+        <w:br/>
+      </w:r>
+      <w:r>
+        <w:rPr>
+          <w:rStyle w:val="VerbatimChar"/>
+        </w:rPr>
+        <w:t xml:space="preserve">  final String token;</w:t>
+      </w:r>
+      <w:r>
+        <w:br/>
+      </w:r>
+      <w:r>
+        <w:rPr>
+          <w:rStyle w:val="VerbatimChar"/>
+        </w:rPr>
+        <w:t xml:space="preserve">  http.Client? _client;</w:t>
+      </w:r>
+      <w:r>
+        <w:br/>
+      </w:r>
+      <w:r>
+        <w:rPr>
+          <w:rStyle w:val="VerbatimChar"/>
+        </w:rPr>
+        <w:t xml:space="preserve">  StreamController&lt;Map&lt;String, dynamic&gt;&gt;? _controller;</w:t>
+      </w:r>
+      <w:r>
+        <w:br/>
+      </w:r>
+      <w:r>
+        <w:rPr>
+          <w:rStyle w:val="VerbatimChar"/>
+        </w:rPr>
+        <w:t xml:space="preserve">  bool _isActive = false;</w:t>
+      </w:r>
+      <w:r>
+        <w:br/>
+      </w:r>
+      <w:r>
+        <w:br/>
+      </w:r>
+      <w:r>
+        <w:rPr>
+          <w:rStyle w:val="VerbatimChar"/>
+        </w:rPr>
+        <w:t xml:space="preserve">  TellerSseService({required this.baseUrl, required this.token});</w:t>
+      </w:r>
+      <w:r>
+        <w:br/>
+      </w:r>
+      <w:r>
+        <w:br/>
+      </w:r>
+      <w:r>
+        <w:rPr>
+          <w:rStyle w:val="VerbatimChar"/>
+        </w:rPr>
+        <w:t xml:space="preserve">  Stream&lt;Map&lt;String, dynamic&gt;&gt; connect() {</w:t>
+      </w:r>
+      <w:r>
+        <w:br/>
+      </w:r>
+      <w:r>
+        <w:rPr>
+          <w:rStyle w:val="VerbatimChar"/>
+        </w:rPr>
+        <w:t xml:space="preserve">    _controller = StreamController&lt;Map&lt;String, dynamic&gt;&gt;.broadcast();</w:t>
+      </w:r>
+      <w:r>
+        <w:br/>
+      </w:r>
+      <w:r>
+        <w:rPr>
+          <w:rStyle w:val="VerbatimChar"/>
+        </w:rPr>
+        <w:t xml:space="preserve">    _isActive = true;</w:t>
+      </w:r>
+      <w:r>
+        <w:br/>
+      </w:r>
+      <w:r>
+        <w:rPr>
+          <w:rStyle w:val="VerbatimChar"/>
+        </w:rPr>
+        <w:t xml:space="preserve">    _startListening();</w:t>
+      </w:r>
+      <w:r>
+        <w:br/>
+      </w:r>
+      <w:r>
+        <w:rPr>
+          <w:rStyle w:val="VerbatimChar"/>
+        </w:rPr>
+        <w:t xml:space="preserve">    return _controller!.stream;</w:t>
+      </w:r>
+      <w:r>
+        <w:br/>
+      </w:r>
+      <w:r>
+        <w:rPr>
+          <w:rStyle w:val="VerbatimChar"/>
+        </w:rPr>
+        <w:t xml:space="preserve">  }</w:t>
+      </w:r>
+      <w:r>
+        <w:br/>
+      </w:r>
+      <w:r>
+        <w:br/>
+      </w:r>
+      <w:r>
+        <w:rPr>
+          <w:rStyle w:val="VerbatimChar"/>
+        </w:rPr>
+        <w:t xml:space="preserve">  void _startListening() async {</w:t>
+      </w:r>
+      <w:r>
+        <w:br/>
+      </w:r>
+      <w:r>
+        <w:rPr>
+          <w:rStyle w:val="VerbatimChar"/>
+        </w:rPr>
+        <w:t xml:space="preserve">    while (_isActive) {</w:t>
+      </w:r>
+      <w:r>
+        <w:br/>
+      </w:r>
+      <w:r>
+        <w:rPr>
+          <w:rStyle w:val="VerbatimChar"/>
+        </w:rPr>
+        <w:t xml:space="preserve">      try {</w:t>
+      </w:r>
+      <w:r>
+        <w:br/>
+      </w:r>
+      <w:r>
+        <w:rPr>
+          <w:rStyle w:val="VerbatimChar"/>
+        </w:rPr>
+        <w:t xml:space="preserve">        _client = http.Client();</w:t>
+      </w:r>
+      <w:r>
+        <w:br/>
+      </w:r>
+      <w:r>
+        <w:rPr>
+          <w:rStyle w:val="VerbatimChar"/>
+        </w:rPr>
+        <w:t xml:space="preserve">        final request = http.Request(</w:t>
+      </w:r>
+      <w:r>
+        <w:br/>
+      </w:r>
+      <w:r>
+        <w:rPr>
+          <w:rStyle w:val="VerbatimChar"/>
+        </w:rPr>
+        <w:t xml:space="preserve">          'GET',</w:t>
+      </w:r>
+      <w:r>
+        <w:br/>
+      </w:r>
+      <w:r>
+        <w:rPr>
+          <w:rStyle w:val="VerbatimChar"/>
+        </w:rPr>
+        <w:t xml:space="preserve">          Uri.parse('$baseUrl/api/fortune-tellers/sessions/stream'),</w:t>
+      </w:r>
+      <w:r>
+        <w:br/>
+      </w:r>
+      <w:r>
+        <w:rPr>
+          <w:rStyle w:val="VerbatimChar"/>
+        </w:rPr>
+        <w:t xml:space="preserve">        );</w:t>
+      </w:r>
+      <w:r>
+        <w:br/>
+      </w:r>
+      <w:r>
+        <w:rPr>
+          <w:rStyle w:val="VerbatimChar"/>
+        </w:rPr>
+        <w:t xml:space="preserve">        request.headers['Authorization'] = 'Bearer $token';</w:t>
+      </w:r>
+      <w:r>
+        <w:br/>
+      </w:r>
+      <w:r>
+        <w:rPr>
+          <w:rStyle w:val="VerbatimChar"/>
+        </w:rPr>
+        <w:t xml:space="preserve">        request.headers['Accept'] = 'text/event-stream';</w:t>
+      </w:r>
+      <w:r>
+        <w:br/>
+      </w:r>
+      <w:r>
+        <w:rPr>
+          <w:rStyle w:val="VerbatimChar"/>
+        </w:rPr>
+        <w:t xml:space="preserve">        request.headers['Cache-Control'] = 'no-cache';</w:t>
+      </w:r>
+      <w:r>
+        <w:br/>
+      </w:r>
+      <w:r>
+        <w:br/>
+      </w:r>
+      <w:r>
+        <w:rPr>
+          <w:rStyle w:val="VerbatimChar"/>
+        </w:rPr>
+        <w:t xml:space="preserve">        final response = await _client!.send(request);</w:t>
+      </w:r>
+      <w:r>
+        <w:br/>
+      </w:r>
+      <w:r>
+        <w:rPr>
+          <w:rStyle w:val="VerbatimChar"/>
+        </w:rPr>
+        <w:t xml:space="preserve">        if (response.statusCode != 200) {</w:t>
+      </w:r>
+      <w:r>
+        <w:br/>
+      </w:r>
+      <w:r>
+        <w:rPr>
+          <w:rStyle w:val="VerbatimChar"/>
+        </w:rPr>
+        <w:t xml:space="preserve">          await Future.delayed(Duration(seconds: 3));</w:t>
+      </w:r>
+      <w:r>
+        <w:br/>
+      </w:r>
+      <w:r>
+        <w:rPr>
+          <w:rStyle w:val="VerbatimChar"/>
+        </w:rPr>
+        <w:t xml:space="preserve">          continue;</w:t>
+      </w:r>
+      <w:r>
+        <w:br/>
+      </w:r>
+      <w:r>
+        <w:rPr>
+          <w:rStyle w:val="VerbatimChar"/>
+        </w:rPr>
+        <w:t xml:space="preserve">        }</w:t>
+      </w:r>
+      <w:r>
+        <w:br/>
+      </w:r>
+      <w:r>
+        <w:br/>
+      </w:r>
+      <w:r>
+        <w:rPr>
+          <w:rStyle w:val="VerbatimChar"/>
+        </w:rPr>
+        <w:t xml:space="preserve">        String buffer = '';</w:t>
+      </w:r>
+      <w:r>
+        <w:br/>
+      </w:r>
+      <w:r>
+        <w:rPr>
+          <w:rStyle w:val="VerbatimChar"/>
+        </w:rPr>
+        <w:t xml:space="preserve">        await for (final chunk in response.stream.transform(utf8.decoder)) {</w:t>
+      </w:r>
+      <w:r>
+        <w:br/>
+      </w:r>
+      <w:r>
+        <w:rPr>
+          <w:rStyle w:val="VerbatimChar"/>
+        </w:rPr>
+        <w:t xml:space="preserve">          buffer += chunk;</w:t>
+      </w:r>
+      <w:r>
+        <w:br/>
+      </w:r>
+      <w:r>
+        <w:rPr>
+          <w:rStyle w:val="VerbatimChar"/>
+        </w:rPr>
+        <w:t xml:space="preserve">          while (buffer.contains('\n\n')) {</w:t>
+      </w:r>
+      <w:r>
+        <w:br/>
+      </w:r>
+      <w:r>
+        <w:rPr>
+          <w:rStyle w:val="VerbatimChar"/>
+        </w:rPr>
+        <w:t xml:space="preserve">            final idx = buffer.indexOf('\n\n');</w:t>
+      </w:r>
+      <w:r>
+        <w:br/>
+      </w:r>
+      <w:r>
+        <w:rPr>
+          <w:rStyle w:val="VerbatimChar"/>
+        </w:rPr>
+        <w:t xml:space="preserve">            final raw = buffer.substring(0, idx);</w:t>
+      </w:r>
+      <w:r>
+        <w:br/>
+      </w:r>
+      <w:r>
+        <w:rPr>
+          <w:rStyle w:val="VerbatimChar"/>
+        </w:rPr>
+        <w:t xml:space="preserve">            buffer = buffer.substring(idx + 2);</w:t>
+      </w:r>
+      <w:r>
+        <w:br/>
+      </w:r>
+      <w:r>
+        <w:br/>
+      </w:r>
+      <w:r>
+        <w:rPr>
+          <w:rStyle w:val="VerbatimChar"/>
+        </w:rPr>
+        <w:t xml:space="preserve">            String? eventType;</w:t>
+      </w:r>
+      <w:r>
+        <w:br/>
+      </w:r>
+      <w:r>
+        <w:rPr>
+          <w:rStyle w:val="VerbatimChar"/>
+        </w:rPr>
+        <w:t xml:space="preserve">            String? data;</w:t>
+      </w:r>
+      <w:r>
+        <w:br/>
+      </w:r>
+      <w:r>
+        <w:rPr>
+          <w:rStyle w:val="VerbatimChar"/>
+        </w:rPr>
+        <w:t xml:space="preserve">            for (final line in raw.split('\n')) {</w:t>
+      </w:r>
+      <w:r>
+        <w:br/>
+      </w:r>
+      <w:r>
+        <w:rPr>
+          <w:rStyle w:val="VerbatimChar"/>
+        </w:rPr>
+        <w:t xml:space="preserve">              if (line.startsWith('event: ')) eventType = line.substring(7).trim();</w:t>
+      </w:r>
+      <w:r>
+        <w:br/>
+      </w:r>
+      <w:r>
+        <w:rPr>
+          <w:rStyle w:val="VerbatimChar"/>
+        </w:rPr>
+        <w:t xml:space="preserve">              if (line.startsWith('data: ')) data = line.substring(6).trim();</w:t>
+      </w:r>
+      <w:r>
+        <w:br/>
+      </w:r>
+      <w:r>
+        <w:rPr>
+          <w:rStyle w:val="VerbatimChar"/>
+        </w:rPr>
+        <w:t xml:space="preserve">            }</w:t>
+      </w:r>
+      <w:r>
+        <w:br/>
+      </w:r>
+      <w:r>
+        <w:rPr>
+          <w:rStyle w:val="VerbatimChar"/>
+        </w:rPr>
+        <w:t xml:space="preserve">            if (data != null &amp;&amp; eventType != null &amp;&amp; eventType != 'heartbeat') {</w:t>
+      </w:r>
+      <w:r>
+        <w:br/>
+      </w:r>
+      <w:r>
+        <w:rPr>
+          <w:rStyle w:val="VerbatimChar"/>
+        </w:rPr>
+        <w:t xml:space="preserve">              try {</w:t>
+      </w:r>
+      <w:r>
+        <w:br/>
+      </w:r>
+      <w:r>
+        <w:rPr>
+          <w:rStyle w:val="VerbatimChar"/>
+        </w:rPr>
+        <w:t xml:space="preserve">                final parsed = jsonDecode(data);</w:t>
+      </w:r>
+      <w:r>
+        <w:br/>
+      </w:r>
+      <w:r>
+        <w:rPr>
+          <w:rStyle w:val="VerbatimChar"/>
+        </w:rPr>
+        <w:t xml:space="preserve">                if (parsed is Map&lt;String, dynamic&gt;) {</w:t>
+      </w:r>
+      <w:r>
+        <w:br/>
+      </w:r>
+      <w:r>
+        <w:rPr>
+          <w:rStyle w:val="VerbatimChar"/>
+        </w:rPr>
+        <w:t xml:space="preserve">                  parsed['_event'] = eventType;</w:t>
+      </w:r>
+      <w:r>
+        <w:br/>
+      </w:r>
+      <w:r>
+        <w:rPr>
+          <w:rStyle w:val="VerbatimChar"/>
+        </w:rPr>
+        <w:t xml:space="preserve">                  _controller?.add(parsed);</w:t>
+      </w:r>
+      <w:r>
+        <w:br/>
+      </w:r>
+      <w:r>
+        <w:rPr>
+          <w:rStyle w:val="VerbatimChar"/>
+        </w:rPr>
+        <w:t xml:space="preserve">                } else if (parsed is List &amp;&amp; eventType == 'pending_sessions') {</w:t>
+      </w:r>
+      <w:r>
+        <w:br/>
+      </w:r>
+      <w:r>
+        <w:rPr>
+          <w:rStyle w:val="VerbatimChar"/>
+        </w:rPr>
+        <w:t xml:space="preserve">                  _controller?.add({'_event': eventType, 'sessions': parsed});</w:t>
+      </w:r>
+      <w:r>
+        <w:br/>
+      </w:r>
+      <w:r>
+        <w:rPr>
+          <w:rStyle w:val="VerbatimChar"/>
+        </w:rPr>
+        <w:t xml:space="preserve">                }</w:t>
+      </w:r>
+      <w:r>
+        <w:br/>
+      </w:r>
+      <w:r>
+        <w:rPr>
+          <w:rStyle w:val="VerbatimChar"/>
+        </w:rPr>
+        <w:t xml:space="preserve">              } catch (_) {}</w:t>
+      </w:r>
+      <w:r>
+        <w:br/>
+      </w:r>
+      <w:r>
+        <w:rPr>
+          <w:rStyle w:val="VerbatimChar"/>
+        </w:rPr>
+        <w:t xml:space="preserve">            }</w:t>
+      </w:r>
+      <w:r>
+        <w:br/>
+      </w:r>
+      <w:r>
+        <w:rPr>
+          <w:rStyle w:val="VerbatimChar"/>
+        </w:rPr>
+        <w:t xml:space="preserve">          }</w:t>
+      </w:r>
+      <w:r>
+        <w:br/>
+      </w:r>
+      <w:r>
+        <w:rPr>
+          <w:rStyle w:val="VerbatimChar"/>
+        </w:rPr>
+        <w:t xml:space="preserve">        }</w:t>
+      </w:r>
+      <w:r>
+        <w:br/>
+      </w:r>
+      <w:r>
+        <w:rPr>
+          <w:rStyle w:val="VerbatimChar"/>
+        </w:rPr>
+        <w:t xml:space="preserve">      } catch (e) {</w:t>
+      </w:r>
+      <w:r>
+        <w:br/>
+      </w:r>
+      <w:r>
+        <w:rPr>
+          <w:rStyle w:val="VerbatimChar"/>
+        </w:rPr>
+        <w:t xml:space="preserve">        if (!_isActive) break;</w:t>
+      </w:r>
+      <w:r>
+        <w:br/>
+      </w:r>
+      <w:r>
+        <w:rPr>
+          <w:rStyle w:val="VerbatimChar"/>
+        </w:rPr>
+        <w:t xml:space="preserve">        await Future.delayed(Duration(seconds: 3));</w:t>
+      </w:r>
+      <w:r>
+        <w:br/>
+      </w:r>
+      <w:r>
+        <w:rPr>
+          <w:rStyle w:val="VerbatimChar"/>
+        </w:rPr>
+        <w:t xml:space="preserve">      }</w:t>
+      </w:r>
+      <w:r>
+        <w:br/>
+      </w:r>
+      <w:r>
+        <w:rPr>
+          <w:rStyle w:val="VerbatimChar"/>
+        </w:rPr>
+        <w:t xml:space="preserve">    }</w:t>
+      </w:r>
+      <w:r>
+        <w:br/>
+      </w:r>
+      <w:r>
+        <w:rPr>
+          <w:rStyle w:val="VerbatimChar"/>
+        </w:rPr>
+        <w:t xml:space="preserve">  }</w:t>
+      </w:r>
+      <w:r>
+        <w:br/>
+      </w:r>
+      <w:r>
+        <w:br/>
+      </w:r>
+      <w:r>
+        <w:rPr>
+          <w:rStyle w:val="VerbatimChar"/>
+        </w:rPr>
+        <w:t xml:space="preserve">  void disconnect() {</w:t>
+      </w:r>
+      <w:r>
+        <w:br/>
+      </w:r>
+      <w:r>
+        <w:rPr>
+          <w:rStyle w:val="VerbatimChar"/>
+        </w:rPr>
+        <w:t xml:space="preserve">    _isActive = false;</w:t>
+      </w:r>
+      <w:r>
+        <w:br/>
+      </w:r>
+      <w:r>
+        <w:rPr>
+          <w:rStyle w:val="VerbatimChar"/>
+        </w:rPr>
+        <w:t xml:space="preserve">    _client?.close();</w:t>
+      </w:r>
+      <w:r>
+        <w:br/>
+      </w:r>
+      <w:r>
+        <w:rPr>
+          <w:rStyle w:val="VerbatimChar"/>
+        </w:rPr>
+        <w:t xml:space="preserve">    _controller?.close();</w:t>
+      </w:r>
+      <w:r>
+        <w:br/>
+      </w:r>
+      <w:r>
+        <w:rPr>
+          <w:rStyle w:val="VerbatimChar"/>
+        </w:rPr>
+        <w:t xml:space="preserve">  }</w:t>
+      </w:r>
+      <w:r>
+        <w:br/>
+      </w:r>
+      <w:r>
+        <w:rPr>
+          <w:rStyle w:val="VerbatimChar"/>
+        </w:rPr>
+        <w:t xml:space="preserve">}</w:t>
+      </w:r>
+    </w:p>
+    <w:p>
+      <w:r>
+        <w:pict>
+          <v:rect style="width:0;height:1.5pt" o:hralign="center" o:hrstd="t" o:hr="t"/>
+        </w:pict>
+      </w:r>
+    </w:p>
+    <w:bookmarkEnd w:id="96"/>
+    <w:bookmarkEnd w:id="97"/>
+    <w:bookmarkStart w:id="101" w:name="müzik-picker-jeton-bypass-düzeltmesi"/>
+    <w:p>
+      <w:pPr>
+        <w:pStyle w:val="Heading2"/>
+      </w:pPr>
+      <w:r>
+        <w:t xml:space="preserve">23. Müzik Picker — Jeton Bypass Düzeltmesi</w:t>
+      </w:r>
+    </w:p>
+    <w:p>
+      <w:pPr>
+        <w:pStyle w:val="BlockText"/>
+      </w:pPr>
+      <w:r>
+        <w:rPr>
+          <w:bCs/>
+          <w:b/>
+        </w:rPr>
+        <w:t xml:space="preserve">BUG:</w:t>
+      </w:r>
+      <w:r>
+        <w:t xml:space="preserve"> </w:t>
+      </w:r>
+      <w:r>
+        <w:rPr>
+          <w:rStyle w:val="VerbatimChar"/>
+        </w:rPr>
+        <w:t xml:space="preserve">skipPayment: true</w:t>
+      </w:r>
+      <w:r>
+        <w:t xml:space="preserve"> </w:t>
+      </w:r>
+      <w:r>
+        <w:t xml:space="preserve">parametresi müzik picker’da jeton kontrolünü bypass ediyor.</w:t>
+      </w:r>
+    </w:p>
+    <w:bookmarkStart w:id="98" w:name="sorun"/>
+    <w:p>
+      <w:pPr>
+        <w:pStyle w:val="Heading3"/>
+      </w:pPr>
+      <w:r>
+        <w:t xml:space="preserve">23.1 Sorun</w:t>
+      </w:r>
+    </w:p>
+    <w:p>
+      <w:pPr>
+        <w:pStyle w:val="FirstParagraph"/>
+      </w:pPr>
+      <w:r>
+        <w:t xml:space="preserve">Mevcut kodda:</w:t>
+      </w:r>
+    </w:p>
+    <w:p>
+      <w:pPr>
+        <w:pStyle w:val="SourceCode"/>
+      </w:pPr>
+      <w:r>
+        <w:rPr>
+          <w:rStyle w:val="VerbatimChar"/>
+        </w:rPr>
+        <w:t xml:space="preserve">// ❌ YANLIŞ — jeton düşülmeden müzik seçilebiliyor</w:t>
+      </w:r>
+      <w:r>
+        <w:br/>
+      </w:r>
+      <w:r>
+        <w:rPr>
+          <w:rStyle w:val="VerbatimChar"/>
+        </w:rPr>
+        <w:t xml:space="preserve">await api.selectMusic(streamId: streamId, musicId: id, skipPayment: true);</w:t>
+      </w:r>
+    </w:p>
+    <w:bookmarkEnd w:id="98"/>
+    <w:bookmarkStart w:id="99" w:name="çözüm"/>
+    <w:p>
+      <w:pPr>
+        <w:pStyle w:val="Heading3"/>
+      </w:pPr>
+      <w:r>
+        <w:t xml:space="preserve">23.2 Çözüm</w:t>
+      </w:r>
+    </w:p>
+    <w:p>
+      <w:pPr>
+        <w:pStyle w:val="SourceCode"/>
+      </w:pPr>
+      <w:r>
+        <w:rPr>
+          <w:rStyle w:val="VerbatimChar"/>
+        </w:rPr>
+        <w:t xml:space="preserve">// ✅ DOĞRU — her zaman jeton kontrolü yap</w:t>
+      </w:r>
+      <w:r>
+        <w:br/>
+      </w:r>
+      <w:r>
+        <w:rPr>
+          <w:rStyle w:val="VerbatimChar"/>
+        </w:rPr>
+        <w:t xml:space="preserve">await api.selectMusic(streamId: streamId, musicId: id);</w:t>
+      </w:r>
+      <w:r>
+        <w:br/>
+      </w:r>
+      <w:r>
+        <w:rPr>
+          <w:rStyle w:val="VerbatimChar"/>
+        </w:rPr>
+        <w:t xml:space="preserve">// skipPayment parametresini ASLA gönderme</w:t>
+      </w:r>
+      <w:r>
+        <w:br/>
+      </w:r>
+      <w:r>
+        <w:rPr>
+          <w:rStyle w:val="VerbatimChar"/>
+        </w:rPr>
+        <w:t xml:space="preserve">// Backend zaten staff kullanıcıları için jeton düşmüyor</w:t>
+      </w:r>
+    </w:p>
+    <w:bookmarkEnd w:id="99"/>
+    <w:bookmarkStart w:id="100" w:name="kontrol-noktaları"/>
+    <w:p>
+      <w:pPr>
+        <w:pStyle w:val="Heading3"/>
+      </w:pPr>
+      <w:r>
+        <w:t xml:space="preserve">23.3 Kontrol Noktaları</w:t>
+      </w:r>
+    </w:p>
+    <w:p>
+      <w:pPr>
+        <w:numPr>
+          <w:ilvl w:val="0"/>
+          <w:numId w:val="1003"/>
+        </w:numPr>
+        <w:pStyle w:val="Compact"/>
+      </w:pPr>
+      <w:r>
+        <w:rPr>
+          <w:rStyle w:val="VerbatimChar"/>
+        </w:rPr>
+        <w:t xml:space="preserve">skipPayment</w:t>
+      </w:r>
+      <w:r>
+        <w:t xml:space="preserve"> </w:t>
+      </w:r>
+      <w:r>
+        <w:t xml:space="preserve">parametresini arayın:</w:t>
+      </w:r>
+      <w:r>
+        <w:t xml:space="preserve"> </w:t>
+      </w:r>
+      <w:r>
+        <w:rPr>
+          <w:rStyle w:val="VerbatimChar"/>
+        </w:rPr>
+        <w:t xml:space="preserve">grep -r 'skipPayment' lib/</w:t>
+      </w:r>
+    </w:p>
+    <w:p>
+      <w:pPr>
+        <w:numPr>
+          <w:ilvl w:val="0"/>
+          <w:numId w:val="1003"/>
+        </w:numPr>
+        <w:pStyle w:val="Compact"/>
+      </w:pPr>
+      <w:r>
+        <w:rPr>
+          <w:rStyle w:val="VerbatimChar"/>
+        </w:rPr>
+        <w:t xml:space="preserve">skip_payment</w:t>
+      </w:r>
+      <w:r>
+        <w:t xml:space="preserve"> </w:t>
+      </w:r>
+      <w:r>
+        <w:t xml:space="preserve">query param olarak da kullanılmış olabilir</w:t>
+      </w:r>
+    </w:p>
+    <w:p>
+      <w:pPr>
+        <w:numPr>
+          <w:ilvl w:val="0"/>
+          <w:numId w:val="1003"/>
+        </w:numPr>
+        <w:pStyle w:val="Compact"/>
+      </w:pPr>
+      <w:r>
+        <w:t xml:space="preserve">Backend’de staff kontrolü otomatik:</w:t>
+      </w:r>
+      <w:r>
+        <w:t xml:space="preserve"> </w:t>
+      </w:r>
+      <w:r>
+        <w:rPr>
+          <w:rStyle w:val="VerbatimChar"/>
+        </w:rPr>
+        <w:t xml:space="preserve">user.role === 'admin' || user.role === 'yonetici'</w:t>
+      </w:r>
+      <w:r>
+        <w:t xml:space="preserve"> </w:t>
+      </w:r>
+      <w:r>
+        <w:t xml:space="preserve">→ jeton düşülmez</w:t>
+      </w:r>
+    </w:p>
+    <w:p>
+      <w:pPr>
+        <w:numPr>
+          <w:ilvl w:val="0"/>
+          <w:numId w:val="1003"/>
+        </w:numPr>
+        <w:pStyle w:val="Compact"/>
+      </w:pPr>
+      <w:r>
+        <w:t xml:space="preserve">Tüm</w:t>
+      </w:r>
+      <w:r>
+        <w:t xml:space="preserve"> </w:t>
+      </w:r>
+      <w:r>
+        <w:rPr>
+          <w:rStyle w:val="VerbatimChar"/>
+        </w:rPr>
+        <w:t xml:space="preserve">skipPayment: true</w:t>
+      </w:r>
+      <w:r>
+        <w:t xml:space="preserve"> </w:t>
+      </w:r>
+      <w:r>
+        <w:t xml:space="preserve">referanslarını kaldırın</w:t>
+      </w:r>
+    </w:p>
+    <w:p>
+      <w:r>
+        <w:pict>
+          <v:rect style="width:0;height:1.5pt" o:hralign="center" o:hrstd="t" o:hr="t"/>
+        </w:pict>
+      </w:r>
+    </w:p>
+    <w:bookmarkEnd w:id="100"/>
+    <w:bookmarkEnd w:id="101"/>
+    <w:bookmarkStart w:id="104" w:name="hediye-sse-entegrasyonu"/>
+    <w:p>
+      <w:pPr>
+        <w:pStyle w:val="Heading2"/>
+      </w:pPr>
+      <w:r>
+        <w:t xml:space="preserve">24. Hediye SSE Entegrasyonu</w:t>
+      </w:r>
+    </w:p>
+    <w:p>
+      <w:pPr>
+        <w:pStyle w:val="BlockText"/>
+      </w:pPr>
+      <w:r>
+        <w:rPr>
+          <w:bCs/>
+          <w:b/>
+        </w:rPr>
+        <w:t xml:space="preserve">ÖNCEKİ DURUM:</w:t>
+      </w:r>
+      <w:r>
+        <w:t xml:space="preserve"> </w:t>
+      </w:r>
+      <w:r>
+        <w:t xml:space="preserve">Canlı yayın hediye SSE event’i</w:t>
+      </w:r>
+      <w:r>
+        <w:t xml:space="preserve"> </w:t>
+      </w:r>
+      <w:r>
+        <w:rPr>
+          <w:rStyle w:val="VerbatimChar"/>
+        </w:rPr>
+        <w:t xml:space="preserve">voice_room_sse_service.dart</w:t>
+      </w:r>
+      <w:r>
+        <w:t xml:space="preserve">’ta noop.</w:t>
+      </w:r>
+    </w:p>
+    <w:bookmarkStart w:id="102" w:name="mevcut-sse-event-formatı-canlı-yayın"/>
+    <w:p>
+      <w:pPr>
+        <w:pStyle w:val="Heading3"/>
+      </w:pPr>
+      <w:r>
+        <w:t xml:space="preserve">24.1 Mevcut SSE Event Formatı (Canlı Yayın)</w:t>
+      </w:r>
+    </w:p>
+    <w:p>
+      <w:pPr>
+        <w:pStyle w:val="FirstParagraph"/>
+      </w:pPr>
+      <w:r>
+        <w:t xml:space="preserve">Canlı yayın stream’inde zaten</w:t>
+      </w:r>
+      <w:r>
+        <w:t xml:space="preserve"> </w:t>
+      </w:r>
+      <w:r>
+        <w:rPr>
+          <w:rStyle w:val="VerbatimChar"/>
+        </w:rPr>
+        <w:t xml:space="preserve">gift</w:t>
+      </w:r>
+      <w:r>
+        <w:t xml:space="preserve"> </w:t>
+      </w:r>
+      <w:r>
+        <w:t xml:space="preserve">event’i gönderiliyor:</w:t>
+      </w:r>
+    </w:p>
+    <w:p>
+      <w:pPr>
+        <w:pStyle w:val="SourceCode"/>
+      </w:pPr>
+      <w:r>
+        <w:rPr>
+          <w:rStyle w:val="VerbatimChar"/>
+        </w:rPr>
+        <w:t xml:space="preserve">event: gift</w:t>
+      </w:r>
+      <w:r>
+        <w:br/>
+      </w:r>
+      <w:r>
+        <w:rPr>
+          <w:rStyle w:val="VerbatimChar"/>
+        </w:rPr>
+        <w:t xml:space="preserve">data: {"giftId":"...","giftName":"Kalp","giftImage":"...","quantity":1,"senderName":"Ali","senderId":"...","targetId":"..."}</w:t>
+      </w:r>
+    </w:p>
+    <w:bookmarkEnd w:id="102"/>
+    <w:bookmarkStart w:id="103" w:name="flutterda-işleme"/>
+    <w:p>
+      <w:pPr>
+        <w:pStyle w:val="Heading3"/>
+      </w:pPr>
+      <w:r>
+        <w:t xml:space="preserve">24.2 Flutter’da İşleme</w:t>
+      </w:r>
+    </w:p>
+    <w:p>
+      <w:pPr>
+        <w:pStyle w:val="FirstParagraph"/>
+      </w:pPr>
+      <w:r>
+        <w:rPr>
+          <w:rStyle w:val="VerbatimChar"/>
+        </w:rPr>
+        <w:t xml:space="preserve">voice_room_sse_service.dart</w:t>
+      </w:r>
+      <w:r>
+        <w:t xml:space="preserve">’ta gift event handler’ını implement edin:</w:t>
+      </w:r>
+    </w:p>
+    <w:p>
+      <w:pPr>
+        <w:pStyle w:val="SourceCode"/>
+      </w:pPr>
+      <w:r>
+        <w:rPr>
+          <w:rStyle w:val="VerbatimChar"/>
+        </w:rPr>
+        <w:t xml:space="preserve">case 'gift':</w:t>
+      </w:r>
+      <w:r>
+        <w:br/>
+      </w:r>
+      <w:r>
+        <w:rPr>
+          <w:rStyle w:val="VerbatimChar"/>
+        </w:rPr>
+        <w:t xml:space="preserve">  final giftData = jsonDecode(data);</w:t>
+      </w:r>
+      <w:r>
+        <w:br/>
+      </w:r>
+      <w:r>
+        <w:rPr>
+          <w:rStyle w:val="VerbatimChar"/>
+        </w:rPr>
+        <w:t xml:space="preserve">  // 1. Hediye animasyonunu göster</w:t>
+      </w:r>
+      <w:r>
+        <w:br/>
+      </w:r>
+      <w:r>
+        <w:rPr>
+          <w:rStyle w:val="VerbatimChar"/>
+        </w:rPr>
+        <w:t xml:space="preserve">  _showGiftAnimation(GiftModel(</w:t>
+      </w:r>
+      <w:r>
+        <w:br/>
+      </w:r>
+      <w:r>
+        <w:rPr>
+          <w:rStyle w:val="VerbatimChar"/>
+        </w:rPr>
+        <w:t xml:space="preserve">    id: giftData['giftId'],</w:t>
+      </w:r>
+      <w:r>
+        <w:br/>
+      </w:r>
+      <w:r>
+        <w:rPr>
+          <w:rStyle w:val="VerbatimChar"/>
+        </w:rPr>
+        <w:t xml:space="preserve">    name: giftData['giftName'],</w:t>
+      </w:r>
+      <w:r>
+        <w:br/>
+      </w:r>
+      <w:r>
+        <w:rPr>
+          <w:rStyle w:val="VerbatimChar"/>
+        </w:rPr>
+        <w:t xml:space="preserve">    image: giftData['giftImage'],</w:t>
+      </w:r>
+      <w:r>
+        <w:br/>
+      </w:r>
+      <w:r>
+        <w:rPr>
+          <w:rStyle w:val="VerbatimChar"/>
+        </w:rPr>
+        <w:t xml:space="preserve">    quantity: giftData['quantity'] ?? 1,</w:t>
+      </w:r>
+      <w:r>
+        <w:br/>
+      </w:r>
+      <w:r>
+        <w:rPr>
+          <w:rStyle w:val="VerbatimChar"/>
+        </w:rPr>
+        <w:t xml:space="preserve">    senderName: giftData['senderName'],</w:t>
+      </w:r>
+      <w:r>
+        <w:br/>
+      </w:r>
+      <w:r>
+        <w:rPr>
+          <w:rStyle w:val="VerbatimChar"/>
+        </w:rPr>
+        <w:t xml:space="preserve">  ));</w:t>
+      </w:r>
+      <w:r>
+        <w:br/>
+      </w:r>
+      <w:r>
+        <w:rPr>
+          <w:rStyle w:val="VerbatimChar"/>
+        </w:rPr>
+        <w:t xml:space="preserve">  // 2. Toplam hediye sayısını güncelle</w:t>
+      </w:r>
+      <w:r>
+        <w:br/>
+      </w:r>
+      <w:r>
+        <w:rPr>
+          <w:rStyle w:val="VerbatimChar"/>
+        </w:rPr>
+        <w:t xml:space="preserve">  if (mounted) {</w:t>
+      </w:r>
+      <w:r>
+        <w:br/>
+      </w:r>
+      <w:r>
+        <w:rPr>
+          <w:rStyle w:val="VerbatimChar"/>
+        </w:rPr>
+        <w:t xml:space="preserve">    setState(() {</w:t>
+      </w:r>
+      <w:r>
+        <w:br/>
+      </w:r>
+      <w:r>
+        <w:rPr>
+          <w:rStyle w:val="VerbatimChar"/>
+        </w:rPr>
+        <w:t xml:space="preserve">      totalGiftsReceived += giftData['quantity'] ?? 1;</w:t>
+      </w:r>
+      <w:r>
+        <w:br/>
+      </w:r>
+      <w:r>
+        <w:rPr>
+          <w:rStyle w:val="VerbatimChar"/>
+        </w:rPr>
+        <w:t xml:space="preserve">    });</w:t>
+      </w:r>
+      <w:r>
+        <w:br/>
+      </w:r>
+      <w:r>
+        <w:rPr>
+          <w:rStyle w:val="VerbatimChar"/>
+        </w:rPr>
+        <w:t xml:space="preserve">  }</w:t>
+      </w:r>
+      <w:r>
+        <w:br/>
+      </w:r>
+      <w:r>
+        <w:rPr>
+          <w:rStyle w:val="VerbatimChar"/>
+        </w:rPr>
+        <w:t xml:space="preserve">  break;</w:t>
+      </w:r>
+    </w:p>
+    <w:p>
+      <w:r>
+        <w:pict>
+          <v:rect style="width:0;height:1.5pt" o:hralign="center" o:hrstd="t" o:hr="t"/>
+        </w:pict>
+      </w:r>
+    </w:p>
+    <w:bookmarkEnd w:id="103"/>
+    <w:bookmarkEnd w:id="104"/>
+    <w:bookmarkStart w:id="106" w:name="e2e-smoke-test-önerileri"/>
+    <w:p>
+      <w:pPr>
+        <w:pStyle w:val="Heading2"/>
+      </w:pPr>
+      <w:r>
+        <w:t xml:space="preserve">25. E2E Smoke Test Önerileri</w:t>
+      </w:r>
+    </w:p>
+    <w:bookmarkStart w:id="105" w:name="jwt-auth-smoke-test"/>
+    <w:p>
+      <w:pPr>
+        <w:pStyle w:val="Heading3"/>
+      </w:pPr>
+      <w:r>
+        <w:t xml:space="preserve">25.1 JWT Auth Smoke Test</w:t>
+      </w:r>
+    </w:p>
+    <w:p>
+      <w:pPr>
+        <w:pStyle w:val="SourceCode"/>
+      </w:pPr>
+      <w:r>
+        <w:rPr>
+          <w:rStyle w:val="VerbatimChar"/>
+        </w:rPr>
+        <w:t xml:space="preserve">// test/e2e/auth_smoke_test.dart</w:t>
+      </w:r>
+      <w:r>
+        <w:br/>
+      </w:r>
+      <w:r>
+        <w:rPr>
+          <w:rStyle w:val="VerbatimChar"/>
+        </w:rPr>
+        <w:t xml:space="preserve">import 'package:http/http.dart' as http;</w:t>
+      </w:r>
+      <w:r>
+        <w:br/>
+      </w:r>
+      <w:r>
+        <w:rPr>
+          <w:rStyle w:val="VerbatimChar"/>
+        </w:rPr>
+        <w:t xml:space="preserve">import 'package:test/test.dart';</w:t>
+      </w:r>
+      <w:r>
+        <w:br/>
+      </w:r>
+      <w:r>
+        <w:br/>
+      </w:r>
+      <w:r>
+        <w:rPr>
+          <w:rStyle w:val="VerbatimChar"/>
+        </w:rPr>
+        <w:t xml:space="preserve">const baseUrl = 'https://canlifal.com';</w:t>
+      </w:r>
+      <w:r>
+        <w:br/>
+      </w:r>
+      <w:r>
+        <w:br/>
+      </w:r>
+      <w:r>
+        <w:rPr>
+          <w:rStyle w:val="VerbatimChar"/>
+        </w:rPr>
+        <w:t xml:space="preserve">void main() {</w:t>
+      </w:r>
+      <w:r>
+        <w:br/>
+      </w:r>
+      <w:r>
+        <w:rPr>
+          <w:rStyle w:val="VerbatimChar"/>
+        </w:rPr>
+        <w:t xml:space="preserve">  String? jwt;</w:t>
+      </w:r>
+      <w:r>
+        <w:br/>
+      </w:r>
+      <w:r>
+        <w:br/>
+      </w:r>
+      <w:r>
+        <w:rPr>
+          <w:rStyle w:val="VerbatimChar"/>
+        </w:rPr>
+        <w:t xml:space="preserve">  test('Login ve JWT al', () async {</w:t>
+      </w:r>
+      <w:r>
+        <w:br/>
+      </w:r>
+      <w:r>
+        <w:rPr>
+          <w:rStyle w:val="VerbatimChar"/>
+        </w:rPr>
+        <w:t xml:space="preserve">    final res = await http.post(</w:t>
+      </w:r>
+      <w:r>
+        <w:br/>
+      </w:r>
+      <w:r>
+        <w:rPr>
+          <w:rStyle w:val="VerbatimChar"/>
+        </w:rPr>
+        <w:t xml:space="preserve">      Uri.parse('$baseUrl/api/auth/mobile-login'),</w:t>
+      </w:r>
+      <w:r>
+        <w:br/>
+      </w:r>
+      <w:r>
+        <w:rPr>
+          <w:rStyle w:val="VerbatimChar"/>
+        </w:rPr>
+        <w:t xml:space="preserve">      headers: {'Content-Type': 'application/json'},</w:t>
+      </w:r>
+      <w:r>
+        <w:br/>
+      </w:r>
+      <w:r>
+        <w:rPr>
+          <w:rStyle w:val="VerbatimChar"/>
+        </w:rPr>
+        <w:t xml:space="preserve">      body: jsonEncode({'email': 'test@test.com', 'password': 'test123'}),</w:t>
+      </w:r>
+      <w:r>
+        <w:br/>
+      </w:r>
+      <w:r>
+        <w:rPr>
+          <w:rStyle w:val="VerbatimChar"/>
+        </w:rPr>
+        <w:t xml:space="preserve">    );</w:t>
+      </w:r>
+      <w:r>
+        <w:br/>
+      </w:r>
+      <w:r>
+        <w:rPr>
+          <w:rStyle w:val="VerbatimChar"/>
+        </w:rPr>
+        <w:t xml:space="preserve">    expect(res.statusCode, 200);</w:t>
+      </w:r>
+      <w:r>
+        <w:br/>
+      </w:r>
+      <w:r>
+        <w:rPr>
+          <w:rStyle w:val="VerbatimChar"/>
+        </w:rPr>
+        <w:t xml:space="preserve">    final body = jsonDecode(res.body);</w:t>
+      </w:r>
+      <w:r>
+        <w:br/>
+      </w:r>
+      <w:r>
+        <w:rPr>
+          <w:rStyle w:val="VerbatimChar"/>
+        </w:rPr>
+        <w:t xml:space="preserve">    jwt = body['token'];</w:t>
+      </w:r>
+      <w:r>
+        <w:br/>
+      </w:r>
+      <w:r>
+        <w:rPr>
+          <w:rStyle w:val="VerbatimChar"/>
+        </w:rPr>
+        <w:t xml:space="preserve">    expect(jwt, isNotNull);</w:t>
+      </w:r>
+      <w:r>
+        <w:br/>
+      </w:r>
+      <w:r>
+        <w:rPr>
+          <w:rStyle w:val="VerbatimChar"/>
+        </w:rPr>
+        <w:t xml:space="preserve">  });</w:t>
+      </w:r>
+      <w:r>
+        <w:br/>
+      </w:r>
+      <w:r>
+        <w:br/>
+      </w:r>
+      <w:r>
+        <w:rPr>
+          <w:rStyle w:val="VerbatimChar"/>
+        </w:rPr>
+        <w:t xml:space="preserve">  test('Profil bilgisi al', () async {</w:t>
+      </w:r>
+      <w:r>
+        <w:br/>
+      </w:r>
+      <w:r>
+        <w:rPr>
+          <w:rStyle w:val="VerbatimChar"/>
+        </w:rPr>
+        <w:t xml:space="preserve">    final res = await http.get(</w:t>
+      </w:r>
+      <w:r>
+        <w:br/>
+      </w:r>
+      <w:r>
+        <w:rPr>
+          <w:rStyle w:val="VerbatimChar"/>
+        </w:rPr>
+        <w:t xml:space="preserve">      Uri.parse('$baseUrl/api/auth/profile'),</w:t>
+      </w:r>
+      <w:r>
+        <w:br/>
+      </w:r>
+      <w:r>
+        <w:rPr>
+          <w:rStyle w:val="VerbatimChar"/>
+        </w:rPr>
+        <w:t xml:space="preserve">      headers: {'Authorization': 'Bearer $jwt'},</w:t>
+      </w:r>
+      <w:r>
+        <w:br/>
+      </w:r>
+      <w:r>
+        <w:rPr>
+          <w:rStyle w:val="VerbatimChar"/>
+        </w:rPr>
+        <w:t xml:space="preserve">    );</w:t>
+      </w:r>
+      <w:r>
+        <w:br/>
+      </w:r>
+      <w:r>
+        <w:rPr>
+          <w:rStyle w:val="VerbatimChar"/>
+        </w:rPr>
+        <w:t xml:space="preserve">    expect(res.statusCode, 200);</w:t>
+      </w:r>
+      <w:r>
+        <w:br/>
+      </w:r>
+      <w:r>
+        <w:rPr>
+          <w:rStyle w:val="VerbatimChar"/>
+        </w:rPr>
+        <w:t xml:space="preserve">  });</w:t>
+      </w:r>
+      <w:r>
+        <w:br/>
+      </w:r>
+      <w:r>
+        <w:br/>
+      </w:r>
+      <w:r>
+        <w:rPr>
+          <w:rStyle w:val="VerbatimChar"/>
+        </w:rPr>
+        <w:t xml:space="preserve">  test('Falcı listesi al', () async {</w:t>
+      </w:r>
+      <w:r>
+        <w:br/>
+      </w:r>
+      <w:r>
+        <w:rPr>
+          <w:rStyle w:val="VerbatimChar"/>
+        </w:rPr>
+        <w:t xml:space="preserve">    final res = await http.get(</w:t>
+      </w:r>
+      <w:r>
+        <w:br/>
+      </w:r>
+      <w:r>
+        <w:rPr>
+          <w:rStyle w:val="VerbatimChar"/>
+        </w:rPr>
+        <w:t xml:space="preserve">      Uri.parse('$baseUrl/api/fortune-tellers'),</w:t>
+      </w:r>
+      <w:r>
+        <w:br/>
+      </w:r>
+      <w:r>
+        <w:rPr>
+          <w:rStyle w:val="VerbatimChar"/>
+        </w:rPr>
+        <w:t xml:space="preserve">      headers: {'Authorization': 'Bearer $jwt'},</w:t>
+      </w:r>
+      <w:r>
+        <w:br/>
+      </w:r>
+      <w:r>
+        <w:rPr>
+          <w:rStyle w:val="VerbatimChar"/>
+        </w:rPr>
+        <w:t xml:space="preserve">    );</w:t>
+      </w:r>
+      <w:r>
+        <w:br/>
+      </w:r>
+      <w:r>
+        <w:rPr>
+          <w:rStyle w:val="VerbatimChar"/>
+        </w:rPr>
+        <w:t xml:space="preserve">    expect(res.statusCode, 200);</w:t>
+      </w:r>
+      <w:r>
+        <w:br/>
+      </w:r>
+      <w:r>
+        <w:rPr>
+          <w:rStyle w:val="VerbatimChar"/>
+        </w:rPr>
+        <w:t xml:space="preserve">    final list = jsonDecode(res.body);</w:t>
+      </w:r>
+      <w:r>
+        <w:br/>
+      </w:r>
+      <w:r>
+        <w:rPr>
+          <w:rStyle w:val="VerbatimChar"/>
+        </w:rPr>
+        <w:t xml:space="preserve">    expect(list, isList);</w:t>
+      </w:r>
+      <w:r>
+        <w:br/>
+      </w:r>
+      <w:r>
+        <w:rPr>
+          <w:rStyle w:val="VerbatimChar"/>
+        </w:rPr>
+        <w:t xml:space="preserve">  });</w:t>
+      </w:r>
+      <w:r>
+        <w:br/>
+      </w:r>
+      <w:r>
+        <w:br/>
+      </w:r>
+      <w:r>
+        <w:rPr>
+          <w:rStyle w:val="VerbatimChar"/>
+        </w:rPr>
+        <w:t xml:space="preserve">  test('Room SSE bağlantısı', () async {</w:t>
+      </w:r>
+      <w:r>
+        <w:br/>
+      </w:r>
+      <w:r>
+        <w:rPr>
+          <w:rStyle w:val="VerbatimChar"/>
+        </w:rPr>
+        <w:t xml:space="preserve">    // Not: Gerçek sessionId gerekir, mock session oluştur</w:t>
+      </w:r>
+      <w:r>
+        <w:br/>
+      </w:r>
+      <w:r>
+        <w:rPr>
+          <w:rStyle w:val="VerbatimChar"/>
+        </w:rPr>
+        <w:t xml:space="preserve">    // Bu test CI'da skip edilebilir</w:t>
+      </w:r>
+      <w:r>
+        <w:br/>
+      </w:r>
+      <w:r>
+        <w:rPr>
+          <w:rStyle w:val="VerbatimChar"/>
+        </w:rPr>
+        <w:t xml:space="preserve">  }, skip: 'Gerçek session gerekli');</w:t>
+      </w:r>
+      <w:r>
+        <w:br/>
+      </w:r>
+      <w:r>
+        <w:rPr>
+          <w:rStyle w:val="VerbatimChar"/>
+        </w:rPr>
+        <w:t xml:space="preserve">}</w:t>
+      </w:r>
+    </w:p>
+    <w:p>
+      <w:r>
+        <w:pict>
+          <v:rect style="width:0;height:1.5pt" o:hralign="center" o:hrstd="t" o:hr="t"/>
+        </w:pict>
+      </w:r>
+    </w:p>
+    <w:bookmarkEnd w:id="105"/>
+    <w:bookmarkEnd w:id="106"/>
+    <w:bookmarkStart w:id="112" w:name="önemli-notlar"/>
+    <w:p>
+      <w:pPr>
+        <w:pStyle w:val="Heading2"/>
+      </w:pPr>
+      <w:r>
         <w:t xml:space="preserve">ÖNEMLİ NOTLAR</w:t>
       </w:r>
     </w:p>
-    <w:bookmarkStart w:id="89" w:name="auth-header"/>
+    <w:bookmarkStart w:id="107" w:name="auth-header"/>
     <w:p>
       <w:pPr>
         <w:pStyle w:val="Heading3"/>
@@ -30417,8 +33261,8 @@
         <w:t xml:space="preserve">Authorization: Bearer {JWT_TOKEN}</w:t>
       </w:r>
     </w:p>
-    <w:bookmarkEnd w:id="89"/>
-    <w:bookmarkStart w:id="90" w:name="base-url"/>
+    <w:bookmarkEnd w:id="107"/>
+    <w:bookmarkStart w:id="108" w:name="base-url"/>
     <w:p>
       <w:pPr>
         <w:pStyle w:val="Heading3"/>
@@ -30438,26 +33282,26 @@
         <w:t xml:space="preserve">https://canlifal.com</w:t>
       </w:r>
     </w:p>
-    <w:bookmarkEnd w:id="90"/>
-    <w:bookmarkStart w:id="91" w:name="polling-aralıkları"/>
+    <w:bookmarkEnd w:id="108"/>
+    <w:bookmarkStart w:id="109" w:name="iletişim-stratejisi-güncellenmiş"/>
     <w:p>
       <w:pPr>
         <w:pStyle w:val="Heading3"/>
       </w:pPr>
       <w:r>
-        <w:t xml:space="preserve">Polling Aralıkları</w:t>
+        <w:t xml:space="preserve">İletişim Stratejisi (Güncellenmiş)</w:t>
       </w:r>
     </w:p>
     <w:tbl>
       <w:tblPr>
         <w:tblStyle w:val="Table"/>
-        <w:tblW w:type="auto" w:w="0"/>
+        <w:tblW w:type="pct" w:w="5000"/>
         <w:tblLook w:firstRow="1" w:lastRow="0" w:firstColumn="0" w:lastColumn="0" w:noHBand="0" w:noVBand="0" w:val="0020"/>
       </w:tblPr>
       <w:tblGrid>
-        <w:gridCol w:w="2640"/>
-        <w:gridCol w:w="2640"/>
-        <w:gridCol w:w="2640"/>
+        <w:gridCol w:w="1440"/>
+        <w:gridCol w:w="2880"/>
+        <w:gridCol w:w="3600"/>
       </w:tblGrid>
       <w:tr>
         <w:trPr>
@@ -30483,7 +33327,7 @@
               <w:jc w:val="left"/>
             </w:pPr>
             <w:r>
-              <w:t xml:space="preserve">Aralık</w:t>
+              <w:t xml:space="preserve">Yöntem</w:t>
             </w:r>
           </w:p>
         </w:tc>
@@ -30495,7 +33339,7 @@
               <w:jc w:val="left"/>
             </w:pPr>
             <w:r>
-              <w:t xml:space="preserve">Kim</w:t>
+              <w:t xml:space="preserve">Fallback</w:t>
             </w:r>
           </w:p>
         </w:tc>
@@ -30509,7 +33353,7 @@
               <w:jc w:val="left"/>
             </w:pPr>
             <w:r>
-              <w:t xml:space="preserve">Bekleyen talepler</w:t>
+              <w:t xml:space="preserve">Oda mesajları</w:t>
             </w:r>
           </w:p>
         </w:tc>
@@ -30521,7 +33365,20 @@
               <w:jc w:val="left"/>
             </w:pPr>
             <w:r>
-              <w:t xml:space="preserve">3-5 sn</w:t>
+              <w:rPr>
+                <w:bCs/>
+                <w:b/>
+              </w:rPr>
+              <w:t xml:space="preserve">SSE</w:t>
+            </w:r>
+            <w:r>
+              <w:t xml:space="preserve"> </w:t>
+            </w:r>
+            <w:r>
+              <w:rPr>
+                <w:rStyle w:val="VerbatimChar"/>
+              </w:rPr>
+              <w:t xml:space="preserve">/api/room/{id}/stream</w:t>
             </w:r>
           </w:p>
         </w:tc>
@@ -30533,7 +33390,7 @@
               <w:jc w:val="left"/>
             </w:pPr>
             <w:r>
-              <w:t xml:space="preserve">Falcı (çevrimiçiyken)</w:t>
+              <w:t xml:space="preserve">3 sn polling</w:t>
             </w:r>
           </w:p>
         </w:tc>
@@ -30547,7 +33404,7 @@
               <w:jc w:val="left"/>
             </w:pPr>
             <w:r>
-              <w:t xml:space="preserve">Mesajlar</w:t>
+              <w:t xml:space="preserve">Falcı talepleri</w:t>
             </w:r>
           </w:p>
         </w:tc>
@@ -30559,7 +33416,20 @@
               <w:jc w:val="left"/>
             </w:pPr>
             <w:r>
-              <w:t xml:space="preserve">2-3 sn</w:t>
+              <w:rPr>
+                <w:bCs/>
+                <w:b/>
+              </w:rPr>
+              <w:t xml:space="preserve">SSE</w:t>
+            </w:r>
+            <w:r>
+              <w:t xml:space="preserve"> </w:t>
+            </w:r>
+            <w:r>
+              <w:rPr>
+                <w:rStyle w:val="VerbatimChar"/>
+              </w:rPr>
+              <w:t xml:space="preserve">/api/fortune-tellers/sessions/stream</w:t>
             </w:r>
           </w:p>
         </w:tc>
@@ -30571,7 +33441,58 @@
               <w:jc w:val="left"/>
             </w:pPr>
             <w:r>
-              <w:t xml:space="preserve">Her iki taraf (odadayken)</w:t>
+              <w:t xml:space="preserve">5 sn polling</w:t>
+            </w:r>
+          </w:p>
+        </w:tc>
+      </w:tr>
+      <w:tr>
+        <w:tc>
+          <w:tcPr/>
+          <w:p>
+            <w:pPr>
+              <w:pStyle w:val="Compact"/>
+              <w:jc w:val="left"/>
+            </w:pPr>
+            <w:r>
+              <w:t xml:space="preserve">Canlı yayın</w:t>
+            </w:r>
+          </w:p>
+        </w:tc>
+        <w:tc>
+          <w:tcPr/>
+          <w:p>
+            <w:pPr>
+              <w:pStyle w:val="Compact"/>
+              <w:jc w:val="left"/>
+            </w:pPr>
+            <w:r>
+              <w:rPr>
+                <w:bCs/>
+                <w:b/>
+              </w:rPr>
+              <w:t xml:space="preserve">SSE</w:t>
+            </w:r>
+            <w:r>
+              <w:t xml:space="preserve"> </w:t>
+            </w:r>
+            <w:r>
+              <w:rPr>
+                <w:rStyle w:val="VerbatimChar"/>
+              </w:rPr>
+              <w:t xml:space="preserve">/api/video-streams/{id}/stream</w:t>
+            </w:r>
+          </w:p>
+        </w:tc>
+        <w:tc>
+          <w:tcPr/>
+          <w:p>
+            <w:pPr>
+              <w:pStyle w:val="Compact"/>
+              <w:jc w:val="left"/>
+            </w:pPr>
+            <w:r>
+              <w:t xml:space="preserve">yok</w:t>
             </w:r>
           </w:p>
         </w:tc>
@@ -30597,7 +33518,7 @@
               <w:jc w:val="left"/>
             </w:pPr>
             <w:r>
-              <w:t xml:space="preserve">1-1.5 sn</w:t>
+              <w:t xml:space="preserve">1-1.5 sn polling</w:t>
             </w:r>
           </w:p>
         </w:tc>
@@ -30609,7 +33530,7 @@
               <w:jc w:val="left"/>
             </w:pPr>
             <w:r>
-              <w:t xml:space="preserve">Her iki taraf (odadayken)</w:t>
+              <w:t xml:space="preserve">—</w:t>
             </w:r>
           </w:p>
         </w:tc>
@@ -30647,7 +33568,7 @@
               <w:jc w:val="left"/>
             </w:pPr>
             <w:r>
-              <w:t xml:space="preserve">Her iki taraf (odadayken)</w:t>
+              <w:t xml:space="preserve">—</w:t>
             </w:r>
           </w:p>
         </w:tc>
@@ -30673,7 +33594,7 @@
               <w:jc w:val="left"/>
             </w:pPr>
             <w:r>
-              <w:t xml:space="preserve">3 sn</w:t>
+              <w:t xml:space="preserve">SSE (room stream)</w:t>
             </w:r>
           </w:p>
         </w:tc>
@@ -30685,14 +33606,14 @@
               <w:jc w:val="left"/>
             </w:pPr>
             <w:r>
-              <w:t xml:space="preserve">Kullanıcı (bekleme ekranında)</w:t>
+              <w:t xml:space="preserve">3 sn polling</w:t>
             </w:r>
           </w:p>
         </w:tc>
       </w:tr>
     </w:tbl>
-    <w:bookmarkEnd w:id="91"/>
-    <w:bookmarkStart w:id="92" w:name="jeton-hesaplama-formülü"/>
+    <w:bookmarkEnd w:id="109"/>
+    <w:bookmarkStart w:id="110" w:name="jeton-hesaplama-formülü"/>
     <w:p>
       <w:pPr>
         <w:pStyle w:val="Heading3"/>
@@ -30739,8 +33660,8 @@
         <w:t xml:space="preserve">iade = toplam_ödenen - gerçek_kullanılan_maliyet</w:t>
       </w:r>
     </w:p>
-    <w:bookmarkEnd w:id="92"/>
-    <w:bookmarkStart w:id="93" w:name="durum-geçişleri"/>
+    <w:bookmarkEnd w:id="110"/>
+    <w:bookmarkStart w:id="111" w:name="durum-geçişleri"/>
     <w:p>
       <w:pPr>
         <w:pStyle w:val="Heading3"/>
@@ -30815,10 +33736,20 @@
         </w:rPr>
         <w:t xml:space="preserve">Tüm endpoint’ler, request/response formatları ve iş mantığı gerçek backend kodundan çıkarılmıştır.</w:t>
       </w:r>
-    </w:p>
-    <w:bookmarkEnd w:id="93"/>
-    <w:bookmarkEnd w:id="94"/>
-    <w:bookmarkEnd w:id="95"/>
+      <w:r>
+        <w:br/>
+      </w:r>
+      <w:r>
+        <w:rPr>
+          <w:bCs/>
+          <w:b/>
+        </w:rPr>
+        <w:t xml:space="preserve">Son güncelleme: Haziran 2026 — SSE endpoint’leri eklendi.</w:t>
+      </w:r>
+    </w:p>
+    <w:bookmarkEnd w:id="111"/>
+    <w:bookmarkEnd w:id="112"/>
+    <w:bookmarkEnd w:id="113"/>
     <w:sectPr/>
   </w:body>
 </w:document>
@@ -31120,6 +34051,9 @@
     </w:lvlOverride>
   </w:num>
   <w:num w:numId="1002">
+    <w:abstractNumId w:val="991"/>
+  </w:num>
+  <w:num w:numId="1003">
     <w:abstractNumId w:val="991"/>
   </w:num>
 </w:numbering>

</xml_diff>